<commit_message>
docs: update the cycle 1 status and completion reports with the REG-01 results (DOC-05, DOC-06)
</commit_message>
<xml_diff>
--- a/docs/testing/cycle-1/3 - AlgoGuard Test Completion Report v1.0.docx
+++ b/docs/testing/cycle-1/3 - AlgoGuard Test Completion Report v1.0.docx
@@ -172,7 +172,7 @@
           <w:i w:val="0"/>
           <w:sz w:val="22"/>
         </w:rPr>
-        <w:t>AlgoGuard-CSThesis/AlgoGuard, branch main, product code 940e082 (executed on test tooling commit dafe5e5); release candidate 503cb9b</w:t>
+        <w:t>AlgoGuard-CSThesis/AlgoGuard, branch main, product code 940e082 (executed on test tooling commit dafe5e5); release candidate 503cb9b; fix build 0480899; final build 128855e (CI green on ccbadd8)</w:t>
       </w:r>
     </w:p>
     <w:p>
@@ -218,7 +218,7 @@
           <w:i w:val="0"/>
           <w:sz w:val="22"/>
         </w:rPr>
-        <w:t>AlgoGuard Testing Kanban (GitHub Projects), 20 cards and 15 DEF cards</w:t>
+        <w:t>AlgoGuard Testing Kanban (GitHub Projects), 20 cards and 18 DEF cards</w:t>
       </w:r>
     </w:p>
     <w:p>
@@ -532,7 +532,7 @@
                 <w:sz w:val="20"/>
                 <w:szCs w:val="20"/>
               </w:rPr>
-              <w:t xml:space="preserve">Test Completion Report for test cycle 1 (Iterations 1–5 build)</w:t>
+              <w:t xml:space="preserve">Test Completion Report for test cycle 1 (Iterations 1–5 build), including the 2026-10-20 UI checks, soak, defect fixes and REG-01 re-tests</w:t>
             </w:r>
           </w:p>
         </w:tc>
@@ -1260,7 +1260,7 @@
           <w:i w:val="0"/>
           <w:sz w:val="22"/>
         </w:rPr>
-        <w:t>Cycle 1 does not meet its exit criteria (section 3.3). The deployed Stacking Ensemble misses accuracy, F1, false-positive rate and ROC-AUC on data it was not trained on (four High defects), not every Critical test case was executed, the pass rate is below 95%, the performance budgets were not shown, and UAT is outstanding.</w:t>
+        <w:t>Cycle 1 does not meet its exit criteria (section 3.3). The deployed Stacking Ensemble misses accuracy, F1, false-positive rate and ROC-AUC on data it was not trained on (four High defects), not every Critical test case was executed, the pass rate is below 95%, two performance budgets (live lag and events per second) are missed, and UAT is outstanding.</w:t>
       </w:r>
     </w:p>
     <w:p>
@@ -1274,7 +1274,7 @@
           <w:i w:val="0"/>
           <w:sz w:val="22"/>
         </w:rPr>
-        <w:t>Testing ran on PC A from 2026-10-19 10:45 to 2026-10-20 05:03 (Asia/Manila), two days after the planned window. The Test Log holds 68 executions — 45 passed, 11 failed, 12 not executed — and 15 defects (4 High, 6 Medium, 5 Low, none Critical).</w:t>
+        <w:t>Testing ran on PC A from 2026-10-19 10:45 to 2026-10-20 09:47 (Asia/Manila), two days after the planned window. The Test Log holds 98 executions — 66 passed, 20 failed, 12 not executed — and 18 defects (4 High, 7 Medium, 7 Low, none Critical); 8 were fixed, re-tested and closed during the cycle.</w:t>
       </w:r>
     </w:p>
     <w:p>
@@ -1288,7 +1288,7 @@
           <w:i w:val="0"/>
           <w:sz w:val="22"/>
         </w:rPr>
-        <w:t>What works: the smoke gate, all unit, lint and type checks, the integration lane, model integrity (a corrupted model is refused), offline recovery without loss or duplicates, the dependency and static scans, CSRF and sign-in throttling, role checks and node isolation (pilot and automated evidence).</w:t>
+        <w:t>What works: the smoke gate, all unit, lint and type checks (CI green after the fixes), the integration lane, model integrity (a corrupted model is refused and the Dashboard says so), offline recovery without loss or duplicates, the dependency and static scans, CSRF and sign-in throttling, role checks, no secrets in pages or responses, node isolation (pilot and automated evidence), page layout and keyboard access, live capture with 0% packet drop, and a 30-minute soak well within CPU and memory budgets.</w:t>
       </w:r>
     </w:p>
     <w:p>
@@ -1741,7 +1741,7 @@
                 <w:sz w:val="20"/>
                 <w:szCs w:val="20"/>
               </w:rPr>
-              <w:t xml:space="preserve">2 / 3 / 0</w:t>
+              <w:t xml:space="preserve">3 / 3 / 0</w:t>
             </w:r>
           </w:p>
         </w:tc>
@@ -1771,7 +1771,7 @@
                 <w:sz w:val="20"/>
                 <w:szCs w:val="20"/>
               </w:rPr>
-              <w:t xml:space="preserve">Coverage of services/ 83% (TC-16 pass). CI red on main: Python 3.14.8 instead of the locked 3.14.6 (DEF-01) and one timing-sensitive test (DEF-03). Local stack needed an Edge Runtime restart (DEF-02).</w:t>
+              <w:t xml:space="preserve">Coverage of services/ 83% (TC-16 pass). CI was red on main (Python 3.14.8 instead of the locked 3.14.6, DEF-01; one timing-sensitive test, DEF-03); after the fix, CI run 39341292642 is green. Local stack needed an Edge Runtime restart (DEF-02, now in the README).</w:t>
             </w:r>
           </w:p>
         </w:tc>
@@ -1801,7 +1801,7 @@
                 <w:sz w:val="20"/>
                 <w:szCs w:val="20"/>
               </w:rPr>
-              <w:t xml:space="preserve">To Do</w:t>
+              <w:t xml:space="preserve">Done</w:t>
             </w:r>
           </w:p>
         </w:tc>
@@ -2236,7 +2236,7 @@
                 <w:sz w:val="20"/>
                 <w:szCs w:val="20"/>
               </w:rPr>
-              <w:t xml:space="preserve">Integration lane 65 passed (after DEF-02); Stacking structure confirmed; corrupted model refused (TC-08, Dashboard wording DEF-09); offline records kept and synced once with no duplicates (TC-09).</w:t>
+              <w:t xml:space="preserve">Integration lane 65 passed (after DEF-02); Stacking structure confirmed; corrupted model refused (TC-08); the Dashboard now says 'Unavailable here' for a corrupt copy (DEF-09 fixed and closed); offline records kept and synced once with no duplicates (TC-09). Npcap capture tests not run elevated.</w:t>
             </w:r>
           </w:p>
         </w:tc>
@@ -2391,7 +2391,7 @@
                 <w:sz w:val="20"/>
                 <w:szCs w:val="20"/>
               </w:rPr>
-              <w:t xml:space="preserve">TC-03 fail: model A misses accuracy, F1, false-positive rate and ROC-AUC on unseen data (DEF-04 to DEF-07); recall met; reproducible; model B comparison done (raw-column leak DEF-08).</w:t>
+              <w:t xml:space="preserve">TC-03 fail: model A misses accuracy, F1, false-positive rate and ROC-AUC on unseen data (DEF-04 to DEF-07); recall met; reproducible; model B comparison done (raw-column leak DEF-08, now fixed for training; local deploy check still open).</w:t>
             </w:r>
           </w:p>
         </w:tc>
@@ -2516,7 +2516,7 @@
                 <w:sz w:val="20"/>
                 <w:szCs w:val="20"/>
               </w:rPr>
-              <w:t xml:space="preserve">1 / 2 / 2</w:t>
+              <w:t xml:space="preserve">6 / 5 / 2</w:t>
             </w:r>
           </w:p>
         </w:tc>
@@ -2546,7 +2546,7 @@
                 <w:sz w:val="20"/>
                 <w:szCs w:val="20"/>
               </w:rPr>
-              <w:t xml:space="preserve">PCAP flows classified (service level); bad input partly accepted (DEF-12, DEF-13); truncated PCAP not refused (DEF-14); live capture and cap message not executed this cycle.</w:t>
+              <w:t xml:space="preserve">PCAP replay, live capture (0 packets dropped, own traffic excluded) and the 300-event cap pass; truncated PCAP now refused (DEF-14 closed); 1e308 and negative input now refused in plain language (DEF-13 closed); missing fields still filled with defaults at the server (DEF-12 open, decision needed).</w:t>
             </w:r>
           </w:p>
         </w:tc>
@@ -2826,7 +2826,7 @@
                 <w:sz w:val="20"/>
                 <w:szCs w:val="20"/>
               </w:rPr>
-              <w:t xml:space="preserve">7 / 3 / 2</w:t>
+              <w:t xml:space="preserve">9 / 5 / 2</w:t>
             </w:r>
           </w:p>
         </w:tc>
@@ -2856,7 +2856,7 @@
                 <w:sz w:val="20"/>
                 <w:szCs w:val="20"/>
               </w:rPr>
-              <w:t xml:space="preserve">Pilot budgets mostly met (limits L1, L2: DEF-11, DEF-10). Plan 3.4: 1.92 events/s (not met); lag, packet drop and soak not measured.</w:t>
+              <w:t xml:space="preserve">Packet drop 0%, 30-minute soak CPU max 8.03% and RAM max 352 MB (met). Live lag p95 895.6 ms (DEF-17) and 1.65-1.92 events/s (DEF-11) not met. Pilot limits L1, L2 (DEF-11, DEF-10).</w:t>
             </w:r>
           </w:p>
         </w:tc>
@@ -2886,7 +2886,7 @@
                 <w:sz w:val="20"/>
                 <w:szCs w:val="20"/>
               </w:rPr>
-              <w:t xml:space="preserve">To Do</w:t>
+              <w:t xml:space="preserve">Done</w:t>
             </w:r>
           </w:p>
         </w:tc>
@@ -2981,7 +2981,7 @@
                 <w:sz w:val="20"/>
                 <w:szCs w:val="20"/>
               </w:rPr>
-              <w:t xml:space="preserve">6 / 0 / 0</w:t>
+              <w:t xml:space="preserve">7 / 0 / 0</w:t>
             </w:r>
           </w:p>
         </w:tc>
@@ -3011,7 +3011,7 @@
                 <w:sz w:val="20"/>
                 <w:szCs w:val="20"/>
               </w:rPr>
-              <w:t xml:space="preserve">pip-audit clean; 14 Medium Bandit findings justified; CSRF and throttle tests pass; lockout after 5 wrong passwords (TC-10); analyst refused from admin pages; no secrets in the repository.</w:t>
+              <w:t xml:space="preserve">pip-audit clean; 14 Medium Bandit findings justified; CSRF and throttle tests pass; lockout after 5 wrong passwords (TC-10); analyst refused from admin pages; no secrets in the repository, logs, pages or API responses.</w:t>
             </w:r>
           </w:p>
         </w:tc>
@@ -3041,7 +3041,7 @@
                 <w:sz w:val="20"/>
                 <w:szCs w:val="20"/>
               </w:rPr>
-              <w:t xml:space="preserve">To Do</w:t>
+              <w:t xml:space="preserve">Done</w:t>
             </w:r>
           </w:p>
         </w:tc>
@@ -3136,7 +3136,7 @@
                 <w:sz w:val="20"/>
                 <w:szCs w:val="20"/>
               </w:rPr>
-              <w:t xml:space="preserve">0 / 0 / 1</w:t>
+              <w:t xml:space="preserve">3 / 3 / 1</w:t>
             </w:r>
           </w:p>
         </w:tc>
@@ -3166,7 +3166,7 @@
                 <w:sz w:val="20"/>
                 <w:szCs w:val="20"/>
               </w:rPr>
-              <w:t xml:space="preserve">No results received in the log (TC-12 not executed); a keyboard-access fix from this card was committed (DEF-15, fixed, re-test pending).</w:t>
+              <w:t xml:space="preserve">No sideways scrolling at 1366 and 390 px (TC-12), keyboard and labels pass, Lighthouse Accessibility 100 on three pages; DEF-15 closed; plain-language issues DEF-13 and DEF-18 fixed and closed, DEF-16 (UTC labels) waiting for its UI re-test.</w:t>
             </w:r>
           </w:p>
         </w:tc>
@@ -3291,7 +3291,7 @@
                 <w:sz w:val="20"/>
                 <w:szCs w:val="20"/>
               </w:rPr>
-              <w:t xml:space="preserve">1 / 0 / 2</w:t>
+              <w:t xml:space="preserve">10 / 1 / 2</w:t>
             </w:r>
           </w:p>
         </w:tc>
@@ -3321,7 +3321,7 @@
                 <w:sz w:val="20"/>
                 <w:szCs w:val="20"/>
               </w:rPr>
-              <w:t xml:space="preserve">Full suite re-run on release candidate 503cb9b passed; Lighthouse re-run of DEF-15 and the smoke re-run not executed.</w:t>
+              <w:t xml:space="preserve">Full suite passed on 503cb9b, the fix build 0480899 and the final build 128855e; CI green; DEF-01, 02, 03, 09, 13, 14, 15, 18 re-tested and closed; DEF-08 and DEF-12 partly fixed; smoke passed on 0480899 but was not re-run on 128855e.</w:t>
             </w:r>
           </w:p>
         </w:tc>
@@ -4197,7 +4197,7 @@
                 <w:sz w:val="20"/>
                 <w:szCs w:val="20"/>
               </w:rPr>
-              <w:t xml:space="preserve">Sample PCAP: 82 packets, 11 flows classified (service level); the pilot stored and synced all 11.</w:t>
+              <w:t xml:space="preserve">Sample PCAP through Live Monitor: 11 of 11 flows, 10 alerts, all stored and synced (also on the fix build).</w:t>
             </w:r>
           </w:p>
         </w:tc>
@@ -4292,7 +4292,7 @@
                 <w:sz w:val="20"/>
                 <w:szCs w:val="20"/>
               </w:rPr>
-              <w:t xml:space="preserve">Fail (DEF-12, DEF-13)</w:t>
+              <w:t xml:space="preserve">Fail (DEF-12)</w:t>
             </w:r>
           </w:p>
         </w:tc>
@@ -4322,7 +4322,7 @@
                 <w:sz w:val="20"/>
                 <w:szCs w:val="20"/>
               </w:rPr>
-              <w:t xml:space="preserve">'abc' refused; missing, empty and negative input accepted; 1e308 refused with a technical message.</w:t>
+              <w:t xml:space="preserve">Fix build: 1e308 and negative values refused in plain language, nothing stored; missing numeric fields still filled with defaults at the server (DEF-12).</w:t>
             </w:r>
           </w:p>
         </w:tc>
@@ -5042,7 +5042,7 @@
                 <w:sz w:val="20"/>
                 <w:szCs w:val="20"/>
               </w:rPr>
-              <w:t xml:space="preserve">Not executed</w:t>
+              <w:t xml:space="preserve">Fail (DEF-17)</w:t>
             </w:r>
           </w:p>
         </w:tc>
@@ -5072,7 +5072,7 @@
                 <w:sz w:val="20"/>
                 <w:szCs w:val="20"/>
               </w:rPr>
-              <w:t xml:space="preserve">Live capture results not received; the app stores no per-flow lag.</w:t>
+              <w:t xml:space="preserve">90 s live capture: flows ended by FIN/RST p95 895.6 ms (budget 500 ms), p50 388.9 ms.</w:t>
             </w:r>
           </w:p>
         </w:tc>
@@ -5167,7 +5167,7 @@
                 <w:sz w:val="20"/>
                 <w:szCs w:val="20"/>
               </w:rPr>
-              <w:t xml:space="preserve">Not executed</w:t>
+              <w:t xml:space="preserve">Pass</w:t>
             </w:r>
           </w:p>
         </w:tc>
@@ -5197,7 +5197,7 @@
                 <w:sz w:val="20"/>
                 <w:szCs w:val="20"/>
               </w:rPr>
-              <w:t xml:space="preserve">Usability and Lighthouse results not received.</w:t>
+              <w:t xml:space="preserve">Nine pages at 1366 and 390 px: no sideways scrolling.</w:t>
             </w:r>
           </w:p>
         </w:tc>
@@ -5417,7 +5417,7 @@
                 <w:sz w:val="20"/>
                 <w:szCs w:val="20"/>
               </w:rPr>
-              <w:t xml:space="preserve">Not executed (DEF-15)</w:t>
+              <w:t xml:space="preserve">Fail (DEF-12, DEF-13, DEF-14, DEF-16, DEF-18)</w:t>
             </w:r>
           </w:p>
         </w:tc>
@@ -5447,7 +5447,7 @@
                 <w:sz w:val="20"/>
                 <w:szCs w:val="20"/>
               </w:rPr>
-              <w:t xml:space="preserve">Lighthouse re-run for DEF-15 not done; full suite on 503cb9b passed.</w:t>
+              <w:t xml:space="preserve">Eight fixed defects re-tested and closed; DEF-12 still fails on missing fields; DEF-16 waits for a UI re-test on 128855e.</w:t>
             </w:r>
           </w:p>
         </w:tc>
@@ -10789,7 +10789,7 @@
                 <w:sz w:val="20"/>
                 <w:szCs w:val="20"/>
               </w:rPr>
-              <w:t xml:space="preserve">Not measured: TC-11 not executed. The app stores no flow end time or per-flow lag. (Pilot, different budget: average 13.1 s on PC B including the 15 s idle timeout.)</w:t>
+              <w:t xml:space="preserve">895.6 ms p95 (p50 388.9 ms) over 32 flows ended by FIN/RST in a 90 s live capture of ordinary browsing on PC A</w:t>
             </w:r>
           </w:p>
         </w:tc>
@@ -10819,7 +10819,7 @@
                 <w:sz w:val="20"/>
                 <w:szCs w:val="20"/>
               </w:rPr>
-              <w:t xml:space="preserve">Not measured</w:t>
+              <w:t xml:space="preserve">Not met</w:t>
             </w:r>
           </w:p>
         </w:tc>
@@ -10914,7 +10914,7 @@
                 <w:sz w:val="20"/>
                 <w:szCs w:val="20"/>
               </w:rPr>
-              <w:t xml:space="preserve">1.92 events/s (TC-09 replay, 202 events in 105 s); about 2.0 flows/s (SMK-01 replay); paced source, max 2.86/s</w:t>
+              <w:t xml:space="preserve">1.65 flows/s over the 30-minute Fast replay; 1.92 events/s (TC-09 replay, 202 events in 105 s); paced source, max 2.86/s</w:t>
             </w:r>
           </w:p>
         </w:tc>
@@ -11039,7 +11039,7 @@
                 <w:sz w:val="20"/>
                 <w:szCs w:val="20"/>
               </w:rPr>
-              <w:t xml:space="preserve">Not measured this cycle (pilot: 0% - 0 of 848, 0 of 2,810, 0 of 119,100, 0 of 740 packets)</w:t>
+              <w:t xml:space="preserve">0% (0 of 8,721 packets in the 90 s live capture)</w:t>
             </w:r>
           </w:p>
         </w:tc>
@@ -11069,7 +11069,7 @@
                 <w:sz w:val="20"/>
                 <w:szCs w:val="20"/>
               </w:rPr>
-              <w:t xml:space="preserve">Not measured</w:t>
+              <w:t xml:space="preserve">Met</w:t>
             </w:r>
           </w:p>
         </w:tc>
@@ -11164,7 +11164,7 @@
                 <w:sz w:val="20"/>
                 <w:szCs w:val="20"/>
               </w:rPr>
-              <w:t xml:space="preserve">Not measured this cycle (pilot, different budget: peak 24.5% PC A, 6.3% PC B)</w:t>
+              <w:t xml:space="preserve">Max 8.03%, mean 7.54% of the machine (60 samples, 06:28-06:57)</w:t>
             </w:r>
           </w:p>
         </w:tc>
@@ -11194,7 +11194,7 @@
                 <w:sz w:val="20"/>
                 <w:szCs w:val="20"/>
               </w:rPr>
-              <w:t xml:space="preserve">Not measured</w:t>
+              <w:t xml:space="preserve">Met</w:t>
             </w:r>
           </w:p>
         </w:tc>
@@ -11289,7 +11289,7 @@
                 <w:sz w:val="20"/>
                 <w:szCs w:val="20"/>
               </w:rPr>
-              <w:t xml:space="preserve">Not measured this cycle (pilot: peak 294 MB PC A, 108 MB PC B)</w:t>
+              <w:t xml:space="preserve">Max 352.2 MB; 322.0 MB at the end; whole-run trend -0.1 MB/min (a climb of about 29 MB from 06:32 to 06:52 then flat - a longer soak is suggested)</w:t>
             </w:r>
           </w:p>
         </w:tc>
@@ -11319,7 +11319,7 @@
                 <w:sz w:val="20"/>
                 <w:szCs w:val="20"/>
               </w:rPr>
-              <w:t xml:space="preserve">Not measured</w:t>
+              <w:t xml:space="preserve">Met</w:t>
             </w:r>
           </w:p>
         </w:tc>
@@ -12839,7 +12839,7 @@
                 <w:sz w:val="20"/>
                 <w:szCs w:val="20"/>
               </w:rPr>
-              <w:t xml:space="preserve">1</w:t>
+              <w:t xml:space="preserve">2</w:t>
             </w:r>
           </w:p>
         </w:tc>
@@ -12869,7 +12869,7 @@
                 <w:sz w:val="20"/>
                 <w:szCs w:val="20"/>
               </w:rPr>
-              <w:t xml:space="preserve">DEF-01, DEF-08, DEF-10, DEF-11, DEF-12, DEF-15</w:t>
+              <w:t xml:space="preserve">DEF-01, DEF-08, DEF-10, DEF-11, DEF-12, DEF-15, DEF-17</w:t>
             </w:r>
           </w:p>
         </w:tc>
@@ -12934,7 +12934,7 @@
                 <w:sz w:val="20"/>
                 <w:szCs w:val="20"/>
               </w:rPr>
-              <w:t xml:space="preserve">5</w:t>
+              <w:t xml:space="preserve">1</w:t>
             </w:r>
           </w:p>
         </w:tc>
@@ -12964,7 +12964,7 @@
                 <w:sz w:val="20"/>
                 <w:szCs w:val="20"/>
               </w:rPr>
-              <w:t xml:space="preserve">0</w:t>
+              <w:t xml:space="preserve">6</w:t>
             </w:r>
           </w:p>
         </w:tc>
@@ -12994,7 +12994,7 @@
                 <w:sz w:val="20"/>
                 <w:szCs w:val="20"/>
               </w:rPr>
-              <w:t xml:space="preserve">DEF-02, DEF-03, DEF-09, DEF-13, DEF-14</w:t>
+              <w:t xml:space="preserve">DEF-02, DEF-03, DEF-09, DEF-13, DEF-14, DEF-16, DEF-18</w:t>
             </w:r>
           </w:p>
         </w:tc>
@@ -13349,7 +13349,7 @@
                 <w:sz w:val="20"/>
                 <w:szCs w:val="20"/>
               </w:rPr>
-              <w:t xml:space="preserve">Open</w:t>
+              <w:t xml:space="preserve">Closed</w:t>
             </w:r>
           </w:p>
         </w:tc>
@@ -13534,7 +13534,7 @@
                 <w:sz w:val="20"/>
                 <w:szCs w:val="20"/>
               </w:rPr>
-              <w:t xml:space="preserve">Open</w:t>
+              <w:t xml:space="preserve">Closed</w:t>
             </w:r>
           </w:p>
         </w:tc>
@@ -13719,7 +13719,7 @@
                 <w:sz w:val="20"/>
                 <w:szCs w:val="20"/>
               </w:rPr>
-              <w:t xml:space="preserve">Open</w:t>
+              <w:t xml:space="preserve">Closed</w:t>
             </w:r>
           </w:p>
         </w:tc>
@@ -14829,7 +14829,7 @@
                 <w:sz w:val="20"/>
                 <w:szCs w:val="20"/>
               </w:rPr>
-              <w:t xml:space="preserve">Open</w:t>
+              <w:t xml:space="preserve">Closed</w:t>
             </w:r>
           </w:p>
         </w:tc>
@@ -15569,7 +15569,7 @@
                 <w:sz w:val="20"/>
                 <w:szCs w:val="20"/>
               </w:rPr>
-              <w:t xml:space="preserve">Open</w:t>
+              <w:t xml:space="preserve">Closed</w:t>
             </w:r>
           </w:p>
         </w:tc>
@@ -15754,7 +15754,7 @@
                 <w:sz w:val="20"/>
                 <w:szCs w:val="20"/>
               </w:rPr>
-              <w:t xml:space="preserve">Open</w:t>
+              <w:t xml:space="preserve">Closed</w:t>
             </w:r>
           </w:p>
         </w:tc>
@@ -15939,7 +15939,7 @@
                 <w:sz w:val="20"/>
                 <w:szCs w:val="20"/>
               </w:rPr>
-              <w:t xml:space="preserve">Fixed - re-test pending</w:t>
+              <w:t xml:space="preserve">Closed</w:t>
             </w:r>
           </w:p>
         </w:tc>
@@ -16000,6 +16000,561 @@
                 <w:szCs w:val="20"/>
               </w:rPr>
               <w:t xml:space="preserve">Live Monitor's scrolling flow feed cannot be reached by keyboard (Lighthouse: scrollable content not keyboard-accessible)</w:t>
+            </w:r>
+          </w:p>
+        </w:tc>
+      </w:tr>
+      <w:tr>
+        <w:trPr>
+          <w:cantSplit/>
+        </w:trPr>
+        <w:tc>
+          <w:tcPr>
+            <w:tcW w:type="dxa" w:w="850"/>
+            <w:tcBorders>
+              <w:top w:val="single" w:color="808080" w:sz="4"/>
+              <w:left w:val="single" w:color="808080" w:sz="4"/>
+              <w:bottom w:val="single" w:color="808080" w:sz="4"/>
+              <w:right w:val="single" w:color="808080" w:sz="4"/>
+            </w:tcBorders>
+            <w:tcMar>
+              <w:top w:type="dxa" w:w="60"/>
+              <w:left w:type="dxa" w:w="100"/>
+              <w:bottom w:type="dxa" w:w="60"/>
+              <w:right w:type="dxa" w:w="100"/>
+            </w:tcMar>
+          </w:tcPr>
+          <w:p>
+            <w:pPr>
+              <w:spacing w:after="0"/>
+            </w:pPr>
+            <w:r>
+              <w:rPr>
+                <w:rFonts w:ascii="Times New Roman" w:cs="Times New Roman" w:eastAsia="Times New Roman" w:hAnsi="Times New Roman"/>
+                <w:sz w:val="20"/>
+                <w:szCs w:val="20"/>
+              </w:rPr>
+              <w:t xml:space="preserve">DEF-16</w:t>
+            </w:r>
+          </w:p>
+        </w:tc>
+        <w:tc>
+          <w:tcPr>
+            <w:tcW w:type="dxa" w:w="900"/>
+            <w:tcBorders>
+              <w:top w:val="single" w:color="808080" w:sz="4"/>
+              <w:left w:val="single" w:color="808080" w:sz="4"/>
+              <w:bottom w:val="single" w:color="808080" w:sz="4"/>
+              <w:right w:val="single" w:color="808080" w:sz="4"/>
+            </w:tcBorders>
+            <w:tcMar>
+              <w:top w:type="dxa" w:w="60"/>
+              <w:left w:type="dxa" w:w="100"/>
+              <w:bottom w:type="dxa" w:w="60"/>
+              <w:right w:type="dxa" w:w="100"/>
+            </w:tcMar>
+          </w:tcPr>
+          <w:p>
+            <w:pPr>
+              <w:spacing w:after="0"/>
+            </w:pPr>
+            <w:r>
+              <w:rPr>
+                <w:rFonts w:ascii="Times New Roman" w:cs="Times New Roman" w:eastAsia="Times New Roman" w:hAnsi="Times New Roman"/>
+                <w:sz w:val="20"/>
+                <w:szCs w:val="20"/>
+              </w:rPr>
+              <w:t xml:space="preserve">Low</w:t>
+            </w:r>
+          </w:p>
+        </w:tc>
+        <w:tc>
+          <w:tcPr>
+            <w:tcW w:type="dxa" w:w="900"/>
+            <w:tcBorders>
+              <w:top w:val="single" w:color="808080" w:sz="4"/>
+              <w:left w:val="single" w:color="808080" w:sz="4"/>
+              <w:bottom w:val="single" w:color="808080" w:sz="4"/>
+              <w:right w:val="single" w:color="808080" w:sz="4"/>
+            </w:tcBorders>
+            <w:tcMar>
+              <w:top w:type="dxa" w:w="60"/>
+              <w:left w:type="dxa" w:w="100"/>
+              <w:bottom w:type="dxa" w:w="60"/>
+              <w:right w:type="dxa" w:w="100"/>
+            </w:tcMar>
+          </w:tcPr>
+          <w:p>
+            <w:pPr>
+              <w:spacing w:after="0"/>
+            </w:pPr>
+            <w:r>
+              <w:rPr>
+                <w:rFonts w:ascii="Times New Roman" w:cs="Times New Roman" w:eastAsia="Times New Roman" w:hAnsi="Times New Roman"/>
+                <w:sz w:val="20"/>
+                <w:szCs w:val="20"/>
+              </w:rPr>
+              <w:t xml:space="preserve">Medium</w:t>
+            </w:r>
+          </w:p>
+        </w:tc>
+        <w:tc>
+          <w:tcPr>
+            <w:tcW w:type="dxa" w:w="1300"/>
+            <w:tcBorders>
+              <w:top w:val="single" w:color="808080" w:sz="4"/>
+              <w:left w:val="single" w:color="808080" w:sz="4"/>
+              <w:bottom w:val="single" w:color="808080" w:sz="4"/>
+              <w:right w:val="single" w:color="808080" w:sz="4"/>
+            </w:tcBorders>
+            <w:tcMar>
+              <w:top w:type="dxa" w:w="60"/>
+              <w:left w:type="dxa" w:w="100"/>
+              <w:bottom w:type="dxa" w:w="60"/>
+              <w:right w:type="dxa" w:w="100"/>
+            </w:tcMar>
+          </w:tcPr>
+          <w:p>
+            <w:pPr>
+              <w:spacing w:after="0"/>
+            </w:pPr>
+            <w:r>
+              <w:rPr>
+                <w:rFonts w:ascii="Times New Roman" w:cs="Times New Roman" w:eastAsia="Times New Roman" w:hAnsi="Times New Roman"/>
+                <w:sz w:val="20"/>
+                <w:szCs w:val="20"/>
+              </w:rPr>
+              <w:t xml:space="preserve">Open</w:t>
+            </w:r>
+          </w:p>
+        </w:tc>
+        <w:tc>
+          <w:tcPr>
+            <w:tcW w:type="dxa" w:w="1000"/>
+            <w:tcBorders>
+              <w:top w:val="single" w:color="808080" w:sz="4"/>
+              <w:left w:val="single" w:color="808080" w:sz="4"/>
+              <w:bottom w:val="single" w:color="808080" w:sz="4"/>
+              <w:right w:val="single" w:color="808080" w:sz="4"/>
+            </w:tcBorders>
+            <w:tcMar>
+              <w:top w:type="dxa" w:w="60"/>
+              <w:left w:type="dxa" w:w="100"/>
+              <w:bottom w:type="dxa" w:w="60"/>
+              <w:right w:type="dxa" w:w="100"/>
+            </w:tcMar>
+          </w:tcPr>
+          <w:p>
+            <w:pPr>
+              <w:spacing w:after="0"/>
+            </w:pPr>
+            <w:r>
+              <w:rPr>
+                <w:rFonts w:ascii="Times New Roman" w:cs="Times New Roman" w:eastAsia="Times New Roman" w:hAnsi="Times New Roman"/>
+                <w:sz w:val="20"/>
+                <w:szCs w:val="20"/>
+              </w:rPr>
+              <w:t xml:space="preserve">USE-01</w:t>
+            </w:r>
+          </w:p>
+        </w:tc>
+        <w:tc>
+          <w:tcPr>
+            <w:tcW w:type="dxa" w:w="4410"/>
+            <w:tcBorders>
+              <w:top w:val="single" w:color="808080" w:sz="4"/>
+              <w:left w:val="single" w:color="808080" w:sz="4"/>
+              <w:bottom w:val="single" w:color="808080" w:sz="4"/>
+              <w:right w:val="single" w:color="808080" w:sz="4"/>
+            </w:tcBorders>
+            <w:tcMar>
+              <w:top w:type="dxa" w:w="60"/>
+              <w:left w:type="dxa" w:w="100"/>
+              <w:bottom w:type="dxa" w:w="60"/>
+              <w:right w:type="dxa" w:w="100"/>
+            </w:tcMar>
+          </w:tcPr>
+          <w:p>
+            <w:pPr>
+              <w:spacing w:after="0"/>
+            </w:pPr>
+            <w:r>
+              <w:rPr>
+                <w:rFonts w:ascii="Times New Roman" w:cs="Times New Roman" w:eastAsia="Times New Roman" w:hAnsi="Times New Roman"/>
+                <w:sz w:val="20"/>
+                <w:szCs w:val="20"/>
+              </w:rPr>
+              <w:t xml:space="preserve">Feed, alert and log times are shown in UTC without saying so</w:t>
+            </w:r>
+          </w:p>
+        </w:tc>
+      </w:tr>
+      <w:tr>
+        <w:trPr>
+          <w:cantSplit/>
+        </w:trPr>
+        <w:tc>
+          <w:tcPr>
+            <w:tcW w:type="dxa" w:w="850"/>
+            <w:tcBorders>
+              <w:top w:val="single" w:color="808080" w:sz="4"/>
+              <w:left w:val="single" w:color="808080" w:sz="4"/>
+              <w:bottom w:val="single" w:color="808080" w:sz="4"/>
+              <w:right w:val="single" w:color="808080" w:sz="4"/>
+            </w:tcBorders>
+            <w:tcMar>
+              <w:top w:type="dxa" w:w="60"/>
+              <w:left w:type="dxa" w:w="100"/>
+              <w:bottom w:type="dxa" w:w="60"/>
+              <w:right w:type="dxa" w:w="100"/>
+            </w:tcMar>
+          </w:tcPr>
+          <w:p>
+            <w:pPr>
+              <w:spacing w:after="0"/>
+            </w:pPr>
+            <w:r>
+              <w:rPr>
+                <w:rFonts w:ascii="Times New Roman" w:cs="Times New Roman" w:eastAsia="Times New Roman" w:hAnsi="Times New Roman"/>
+                <w:sz w:val="20"/>
+                <w:szCs w:val="20"/>
+              </w:rPr>
+              <w:t xml:space="preserve">DEF-17</w:t>
+            </w:r>
+          </w:p>
+        </w:tc>
+        <w:tc>
+          <w:tcPr>
+            <w:tcW w:type="dxa" w:w="900"/>
+            <w:tcBorders>
+              <w:top w:val="single" w:color="808080" w:sz="4"/>
+              <w:left w:val="single" w:color="808080" w:sz="4"/>
+              <w:bottom w:val="single" w:color="808080" w:sz="4"/>
+              <w:right w:val="single" w:color="808080" w:sz="4"/>
+            </w:tcBorders>
+            <w:tcMar>
+              <w:top w:type="dxa" w:w="60"/>
+              <w:left w:type="dxa" w:w="100"/>
+              <w:bottom w:type="dxa" w:w="60"/>
+              <w:right w:type="dxa" w:w="100"/>
+            </w:tcMar>
+          </w:tcPr>
+          <w:p>
+            <w:pPr>
+              <w:spacing w:after="0"/>
+            </w:pPr>
+            <w:r>
+              <w:rPr>
+                <w:rFonts w:ascii="Times New Roman" w:cs="Times New Roman" w:eastAsia="Times New Roman" w:hAnsi="Times New Roman"/>
+                <w:sz w:val="20"/>
+                <w:szCs w:val="20"/>
+              </w:rPr>
+              <w:t xml:space="preserve">Medium</w:t>
+            </w:r>
+          </w:p>
+        </w:tc>
+        <w:tc>
+          <w:tcPr>
+            <w:tcW w:type="dxa" w:w="900"/>
+            <w:tcBorders>
+              <w:top w:val="single" w:color="808080" w:sz="4"/>
+              <w:left w:val="single" w:color="808080" w:sz="4"/>
+              <w:bottom w:val="single" w:color="808080" w:sz="4"/>
+              <w:right w:val="single" w:color="808080" w:sz="4"/>
+            </w:tcBorders>
+            <w:tcMar>
+              <w:top w:type="dxa" w:w="60"/>
+              <w:left w:type="dxa" w:w="100"/>
+              <w:bottom w:type="dxa" w:w="60"/>
+              <w:right w:type="dxa" w:w="100"/>
+            </w:tcMar>
+          </w:tcPr>
+          <w:p>
+            <w:pPr>
+              <w:spacing w:after="0"/>
+            </w:pPr>
+            <w:r>
+              <w:rPr>
+                <w:rFonts w:ascii="Times New Roman" w:cs="Times New Roman" w:eastAsia="Times New Roman" w:hAnsi="Times New Roman"/>
+                <w:sz w:val="20"/>
+                <w:szCs w:val="20"/>
+              </w:rPr>
+              <w:t xml:space="preserve">Medium</w:t>
+            </w:r>
+          </w:p>
+        </w:tc>
+        <w:tc>
+          <w:tcPr>
+            <w:tcW w:type="dxa" w:w="1300"/>
+            <w:tcBorders>
+              <w:top w:val="single" w:color="808080" w:sz="4"/>
+              <w:left w:val="single" w:color="808080" w:sz="4"/>
+              <w:bottom w:val="single" w:color="808080" w:sz="4"/>
+              <w:right w:val="single" w:color="808080" w:sz="4"/>
+            </w:tcBorders>
+            <w:tcMar>
+              <w:top w:type="dxa" w:w="60"/>
+              <w:left w:type="dxa" w:w="100"/>
+              <w:bottom w:type="dxa" w:w="60"/>
+              <w:right w:type="dxa" w:w="100"/>
+            </w:tcMar>
+          </w:tcPr>
+          <w:p>
+            <w:pPr>
+              <w:spacing w:after="0"/>
+            </w:pPr>
+            <w:r>
+              <w:rPr>
+                <w:rFonts w:ascii="Times New Roman" w:cs="Times New Roman" w:eastAsia="Times New Roman" w:hAnsi="Times New Roman"/>
+                <w:sz w:val="20"/>
+                <w:szCs w:val="20"/>
+              </w:rPr>
+              <w:t xml:space="preserve">Open</w:t>
+            </w:r>
+          </w:p>
+        </w:tc>
+        <w:tc>
+          <w:tcPr>
+            <w:tcW w:type="dxa" w:w="1000"/>
+            <w:tcBorders>
+              <w:top w:val="single" w:color="808080" w:sz="4"/>
+              <w:left w:val="single" w:color="808080" w:sz="4"/>
+              <w:bottom w:val="single" w:color="808080" w:sz="4"/>
+              <w:right w:val="single" w:color="808080" w:sz="4"/>
+            </w:tcBorders>
+            <w:tcMar>
+              <w:top w:type="dxa" w:w="60"/>
+              <w:left w:type="dxa" w:w="100"/>
+              <w:bottom w:type="dxa" w:w="60"/>
+              <w:right w:type="dxa" w:w="100"/>
+            </w:tcMar>
+          </w:tcPr>
+          <w:p>
+            <w:pPr>
+              <w:spacing w:after="0"/>
+            </w:pPr>
+            <w:r>
+              <w:rPr>
+                <w:rFonts w:ascii="Times New Roman" w:cs="Times New Roman" w:eastAsia="Times New Roman" w:hAnsi="Times New Roman"/>
+                <w:sz w:val="20"/>
+                <w:szCs w:val="20"/>
+              </w:rPr>
+              <w:t xml:space="preserve">PRF-01</w:t>
+            </w:r>
+          </w:p>
+        </w:tc>
+        <w:tc>
+          <w:tcPr>
+            <w:tcW w:type="dxa" w:w="4410"/>
+            <w:tcBorders>
+              <w:top w:val="single" w:color="808080" w:sz="4"/>
+              <w:left w:val="single" w:color="808080" w:sz="4"/>
+              <w:bottom w:val="single" w:color="808080" w:sz="4"/>
+              <w:right w:val="single" w:color="808080" w:sz="4"/>
+            </w:tcBorders>
+            <w:tcMar>
+              <w:top w:type="dxa" w:w="60"/>
+              <w:left w:type="dxa" w:w="100"/>
+              <w:bottom w:type="dxa" w:w="60"/>
+              <w:right w:type="dxa" w:w="100"/>
+            </w:tcMar>
+          </w:tcPr>
+          <w:p>
+            <w:pPr>
+              <w:spacing w:after="0"/>
+            </w:pPr>
+            <w:r>
+              <w:rPr>
+                <w:rFonts w:ascii="Times New Roman" w:cs="Times New Roman" w:eastAsia="Times New Roman" w:hAnsi="Times New Roman"/>
+                <w:sz w:val="20"/>
+                <w:szCs w:val="20"/>
+              </w:rPr>
+              <w:t xml:space="preserve">Live event-to-verdict lag p95 is 895.6 ms for flows ended by FIN/RST (budget &lt;= 500 ms)</w:t>
+            </w:r>
+          </w:p>
+        </w:tc>
+      </w:tr>
+      <w:tr>
+        <w:trPr>
+          <w:cantSplit/>
+        </w:trPr>
+        <w:tc>
+          <w:tcPr>
+            <w:tcW w:type="dxa" w:w="850"/>
+            <w:tcBorders>
+              <w:top w:val="single" w:color="808080" w:sz="4"/>
+              <w:left w:val="single" w:color="808080" w:sz="4"/>
+              <w:bottom w:val="single" w:color="808080" w:sz="4"/>
+              <w:right w:val="single" w:color="808080" w:sz="4"/>
+            </w:tcBorders>
+            <w:tcMar>
+              <w:top w:type="dxa" w:w="60"/>
+              <w:left w:type="dxa" w:w="100"/>
+              <w:bottom w:type="dxa" w:w="60"/>
+              <w:right w:type="dxa" w:w="100"/>
+            </w:tcMar>
+          </w:tcPr>
+          <w:p>
+            <w:pPr>
+              <w:spacing w:after="0"/>
+            </w:pPr>
+            <w:r>
+              <w:rPr>
+                <w:rFonts w:ascii="Times New Roman" w:cs="Times New Roman" w:eastAsia="Times New Roman" w:hAnsi="Times New Roman"/>
+                <w:sz w:val="20"/>
+                <w:szCs w:val="20"/>
+              </w:rPr>
+              <w:t xml:space="preserve">DEF-18</w:t>
+            </w:r>
+          </w:p>
+        </w:tc>
+        <w:tc>
+          <w:tcPr>
+            <w:tcW w:type="dxa" w:w="900"/>
+            <w:tcBorders>
+              <w:top w:val="single" w:color="808080" w:sz="4"/>
+              <w:left w:val="single" w:color="808080" w:sz="4"/>
+              <w:bottom w:val="single" w:color="808080" w:sz="4"/>
+              <w:right w:val="single" w:color="808080" w:sz="4"/>
+            </w:tcBorders>
+            <w:tcMar>
+              <w:top w:type="dxa" w:w="60"/>
+              <w:left w:type="dxa" w:w="100"/>
+              <w:bottom w:type="dxa" w:w="60"/>
+              <w:right w:type="dxa" w:w="100"/>
+            </w:tcMar>
+          </w:tcPr>
+          <w:p>
+            <w:pPr>
+              <w:spacing w:after="0"/>
+            </w:pPr>
+            <w:r>
+              <w:rPr>
+                <w:rFonts w:ascii="Times New Roman" w:cs="Times New Roman" w:eastAsia="Times New Roman" w:hAnsi="Times New Roman"/>
+                <w:sz w:val="20"/>
+                <w:szCs w:val="20"/>
+              </w:rPr>
+              <w:t xml:space="preserve">Low</w:t>
+            </w:r>
+          </w:p>
+        </w:tc>
+        <w:tc>
+          <w:tcPr>
+            <w:tcW w:type="dxa" w:w="900"/>
+            <w:tcBorders>
+              <w:top w:val="single" w:color="808080" w:sz="4"/>
+              <w:left w:val="single" w:color="808080" w:sz="4"/>
+              <w:bottom w:val="single" w:color="808080" w:sz="4"/>
+              <w:right w:val="single" w:color="808080" w:sz="4"/>
+            </w:tcBorders>
+            <w:tcMar>
+              <w:top w:type="dxa" w:w="60"/>
+              <w:left w:type="dxa" w:w="100"/>
+              <w:bottom w:type="dxa" w:w="60"/>
+              <w:right w:type="dxa" w:w="100"/>
+            </w:tcMar>
+          </w:tcPr>
+          <w:p>
+            <w:pPr>
+              <w:spacing w:after="0"/>
+            </w:pPr>
+            <w:r>
+              <w:rPr>
+                <w:rFonts w:ascii="Times New Roman" w:cs="Times New Roman" w:eastAsia="Times New Roman" w:hAnsi="Times New Roman"/>
+                <w:sz w:val="20"/>
+                <w:szCs w:val="20"/>
+              </w:rPr>
+              <w:t xml:space="preserve">Low</w:t>
+            </w:r>
+          </w:p>
+        </w:tc>
+        <w:tc>
+          <w:tcPr>
+            <w:tcW w:type="dxa" w:w="1300"/>
+            <w:tcBorders>
+              <w:top w:val="single" w:color="808080" w:sz="4"/>
+              <w:left w:val="single" w:color="808080" w:sz="4"/>
+              <w:bottom w:val="single" w:color="808080" w:sz="4"/>
+              <w:right w:val="single" w:color="808080" w:sz="4"/>
+            </w:tcBorders>
+            <w:tcMar>
+              <w:top w:type="dxa" w:w="60"/>
+              <w:left w:type="dxa" w:w="100"/>
+              <w:bottom w:type="dxa" w:w="60"/>
+              <w:right w:type="dxa" w:w="100"/>
+            </w:tcMar>
+          </w:tcPr>
+          <w:p>
+            <w:pPr>
+              <w:spacing w:after="0"/>
+            </w:pPr>
+            <w:r>
+              <w:rPr>
+                <w:rFonts w:ascii="Times New Roman" w:cs="Times New Roman" w:eastAsia="Times New Roman" w:hAnsi="Times New Roman"/>
+                <w:sz w:val="20"/>
+                <w:szCs w:val="20"/>
+              </w:rPr>
+              <w:t xml:space="preserve">Closed</w:t>
+            </w:r>
+          </w:p>
+        </w:tc>
+        <w:tc>
+          <w:tcPr>
+            <w:tcW w:type="dxa" w:w="1000"/>
+            <w:tcBorders>
+              <w:top w:val="single" w:color="808080" w:sz="4"/>
+              <w:left w:val="single" w:color="808080" w:sz="4"/>
+              <w:bottom w:val="single" w:color="808080" w:sz="4"/>
+              <w:right w:val="single" w:color="808080" w:sz="4"/>
+            </w:tcBorders>
+            <w:tcMar>
+              <w:top w:type="dxa" w:w="60"/>
+              <w:left w:type="dxa" w:w="100"/>
+              <w:bottom w:type="dxa" w:w="60"/>
+              <w:right w:type="dxa" w:w="100"/>
+            </w:tcMar>
+          </w:tcPr>
+          <w:p>
+            <w:pPr>
+              <w:spacing w:after="0"/>
+            </w:pPr>
+            <w:r>
+              <w:rPr>
+                <w:rFonts w:ascii="Times New Roman" w:cs="Times New Roman" w:eastAsia="Times New Roman" w:hAnsi="Times New Roman"/>
+                <w:sz w:val="20"/>
+                <w:szCs w:val="20"/>
+              </w:rPr>
+              <w:t xml:space="preserve">USE-01</w:t>
+            </w:r>
+          </w:p>
+        </w:tc>
+        <w:tc>
+          <w:tcPr>
+            <w:tcW w:type="dxa" w:w="4410"/>
+            <w:tcBorders>
+              <w:top w:val="single" w:color="808080" w:sz="4"/>
+              <w:left w:val="single" w:color="808080" w:sz="4"/>
+              <w:bottom w:val="single" w:color="808080" w:sz="4"/>
+              <w:right w:val="single" w:color="808080" w:sz="4"/>
+            </w:tcBorders>
+            <w:tcMar>
+              <w:top w:type="dxa" w:w="60"/>
+              <w:left w:type="dxa" w:w="100"/>
+              <w:bottom w:type="dxa" w:w="60"/>
+              <w:right w:type="dxa" w:w="100"/>
+            </w:tcMar>
+          </w:tcPr>
+          <w:p>
+            <w:pPr>
+              <w:spacing w:after="0"/>
+            </w:pPr>
+            <w:r>
+              <w:rPr>
+                <w:rFonts w:ascii="Times New Roman" w:cs="Times New Roman" w:eastAsia="Times New Roman" w:hAnsi="Times New Roman"/>
+                <w:sz w:val="20"/>
+                <w:szCs w:val="20"/>
+              </w:rPr>
+              <w:t xml:space="preserve">System Logs show the word 'None' as the message of every flow_accepted entry</w:t>
             </w:r>
           </w:p>
         </w:tc>
@@ -16571,671 +17126,6 @@
                 <w:sz w:val="20"/>
                 <w:szCs w:val="20"/>
               </w:rPr>
-              <w:t xml:space="preserve">SYS-02.2</w:t>
-            </w:r>
-          </w:p>
-        </w:tc>
-        <w:tc>
-          <w:tcPr>
-            <w:tcW w:type="dxa" w:w="2600"/>
-            <w:tcBorders>
-              <w:top w:val="single" w:color="808080" w:sz="4"/>
-              <w:left w:val="single" w:color="808080" w:sz="4"/>
-              <w:bottom w:val="single" w:color="808080" w:sz="4"/>
-              <w:right w:val="single" w:color="808080" w:sz="4"/>
-            </w:tcBorders>
-            <w:tcMar>
-              <w:top w:type="dxa" w:w="60"/>
-              <w:left w:type="dxa" w:w="100"/>
-              <w:bottom w:type="dxa" w:w="60"/>
-              <w:right w:type="dxa" w:w="100"/>
-            </w:tcMar>
-          </w:tcPr>
-          <w:p>
-            <w:pPr>
-              <w:spacing w:after="0"/>
-            </w:pPr>
-            <w:r>
-              <w:rPr>
-                <w:rFonts w:ascii="Times New Roman" w:cs="Times New Roman" w:eastAsia="Times New Roman" w:hAnsi="Times New Roman"/>
-                <w:sz w:val="20"/>
-                <w:szCs w:val="20"/>
-              </w:rPr>
-              <w:t xml:space="preserve">SYS-02 · John Brian A. Tiopes</w:t>
-            </w:r>
-          </w:p>
-        </w:tc>
-        <w:tc>
-          <w:tcPr>
-            <w:tcW w:type="dxa" w:w="5660"/>
-            <w:tcBorders>
-              <w:top w:val="single" w:color="808080" w:sz="4"/>
-              <w:left w:val="single" w:color="808080" w:sz="4"/>
-              <w:bottom w:val="single" w:color="808080" w:sz="4"/>
-              <w:right w:val="single" w:color="808080" w:sz="4"/>
-            </w:tcBorders>
-            <w:tcMar>
-              <w:top w:type="dxa" w:w="60"/>
-              <w:left w:type="dxa" w:w="100"/>
-              <w:bottom w:type="dxa" w:w="60"/>
-              <w:right w:type="dxa" w:w="100"/>
-            </w:tcMar>
-          </w:tcPr>
-          <w:p>
-            <w:pPr>
-              <w:spacing w:after="0"/>
-            </w:pPr>
-            <w:r>
-              <w:rPr>
-                <w:rFonts w:ascii="Times New Roman" w:cs="Times New Roman" w:eastAsia="Times New Roman" w:hAnsi="Times New Roman"/>
-                <w:sz w:val="20"/>
-                <w:szCs w:val="20"/>
-              </w:rPr>
-              <w:t xml:space="preserve">Live capture needs the app run as administrator and a person at the Live Monitor; no results by close (pilot evidence only).</w:t>
-            </w:r>
-          </w:p>
-        </w:tc>
-      </w:tr>
-      <w:tr>
-        <w:trPr>
-          <w:cantSplit/>
-        </w:trPr>
-        <w:tc>
-          <w:tcPr>
-            <w:tcW w:type="dxa" w:w="1100"/>
-            <w:tcBorders>
-              <w:top w:val="single" w:color="808080" w:sz="4"/>
-              <w:left w:val="single" w:color="808080" w:sz="4"/>
-              <w:bottom w:val="single" w:color="808080" w:sz="4"/>
-              <w:right w:val="single" w:color="808080" w:sz="4"/>
-            </w:tcBorders>
-            <w:tcMar>
-              <w:top w:type="dxa" w:w="60"/>
-              <w:left w:type="dxa" w:w="100"/>
-              <w:bottom w:type="dxa" w:w="60"/>
-              <w:right w:type="dxa" w:w="100"/>
-            </w:tcMar>
-          </w:tcPr>
-          <w:p>
-            <w:pPr>
-              <w:spacing w:after="0"/>
-            </w:pPr>
-            <w:r>
-              <w:rPr>
-                <w:rFonts w:ascii="Times New Roman" w:cs="Times New Roman" w:eastAsia="Times New Roman" w:hAnsi="Times New Roman"/>
-                <w:sz w:val="20"/>
-                <w:szCs w:val="20"/>
-              </w:rPr>
-              <w:t xml:space="preserve">SYS-02.3</w:t>
-            </w:r>
-          </w:p>
-        </w:tc>
-        <w:tc>
-          <w:tcPr>
-            <w:tcW w:type="dxa" w:w="2600"/>
-            <w:tcBorders>
-              <w:top w:val="single" w:color="808080" w:sz="4"/>
-              <w:left w:val="single" w:color="808080" w:sz="4"/>
-              <w:bottom w:val="single" w:color="808080" w:sz="4"/>
-              <w:right w:val="single" w:color="808080" w:sz="4"/>
-            </w:tcBorders>
-            <w:tcMar>
-              <w:top w:type="dxa" w:w="60"/>
-              <w:left w:type="dxa" w:w="100"/>
-              <w:bottom w:type="dxa" w:w="60"/>
-              <w:right w:type="dxa" w:w="100"/>
-            </w:tcMar>
-          </w:tcPr>
-          <w:p>
-            <w:pPr>
-              <w:spacing w:after="0"/>
-            </w:pPr>
-            <w:r>
-              <w:rPr>
-                <w:rFonts w:ascii="Times New Roman" w:cs="Times New Roman" w:eastAsia="Times New Roman" w:hAnsi="Times New Roman"/>
-                <w:sz w:val="20"/>
-                <w:szCs w:val="20"/>
-              </w:rPr>
-              <w:t xml:space="preserve">SYS-02 · John Brian A. Tiopes</w:t>
-            </w:r>
-          </w:p>
-        </w:tc>
-        <w:tc>
-          <w:tcPr>
-            <w:tcW w:type="dxa" w:w="5660"/>
-            <w:tcBorders>
-              <w:top w:val="single" w:color="808080" w:sz="4"/>
-              <w:left w:val="single" w:color="808080" w:sz="4"/>
-              <w:bottom w:val="single" w:color="808080" w:sz="4"/>
-              <w:right w:val="single" w:color="808080" w:sz="4"/>
-            </w:tcBorders>
-            <w:tcMar>
-              <w:top w:type="dxa" w:w="60"/>
-              <w:left w:type="dxa" w:w="100"/>
-              <w:bottom w:type="dxa" w:w="60"/>
-              <w:right w:type="dxa" w:w="100"/>
-            </w:tcMar>
-          </w:tcPr>
-          <w:p>
-            <w:pPr>
-              <w:spacing w:after="0"/>
-            </w:pPr>
-            <w:r>
-              <w:rPr>
-                <w:rFonts w:ascii="Times New Roman" w:cs="Times New Roman" w:eastAsia="Times New Roman" w:hAnsi="Times New Roman"/>
-                <w:sz w:val="20"/>
-                <w:szCs w:val="20"/>
-              </w:rPr>
-              <w:t xml:space="preserve">No replay reached 300 stored events and no capped replay was run by close (automated test and pilot cover the cap).</w:t>
-            </w:r>
-          </w:p>
-        </w:tc>
-      </w:tr>
-      <w:tr>
-        <w:trPr>
-          <w:cantSplit/>
-        </w:trPr>
-        <w:tc>
-          <w:tcPr>
-            <w:tcW w:type="dxa" w:w="1100"/>
-            <w:tcBorders>
-              <w:top w:val="single" w:color="808080" w:sz="4"/>
-              <w:left w:val="single" w:color="808080" w:sz="4"/>
-              <w:bottom w:val="single" w:color="808080" w:sz="4"/>
-              <w:right w:val="single" w:color="808080" w:sz="4"/>
-            </w:tcBorders>
-            <w:tcMar>
-              <w:top w:type="dxa" w:w="60"/>
-              <w:left w:type="dxa" w:w="100"/>
-              <w:bottom w:type="dxa" w:w="60"/>
-              <w:right w:type="dxa" w:w="100"/>
-            </w:tcMar>
-          </w:tcPr>
-          <w:p>
-            <w:pPr>
-              <w:spacing w:after="0"/>
-            </w:pPr>
-            <w:r>
-              <w:rPr>
-                <w:rFonts w:ascii="Times New Roman" w:cs="Times New Roman" w:eastAsia="Times New Roman" w:hAnsi="Times New Roman"/>
-                <w:sz w:val="20"/>
-                <w:szCs w:val="20"/>
-              </w:rPr>
-              <w:t xml:space="preserve">TC-11</w:t>
-            </w:r>
-          </w:p>
-        </w:tc>
-        <w:tc>
-          <w:tcPr>
-            <w:tcW w:type="dxa" w:w="2600"/>
-            <w:tcBorders>
-              <w:top w:val="single" w:color="808080" w:sz="4"/>
-              <w:left w:val="single" w:color="808080" w:sz="4"/>
-              <w:bottom w:val="single" w:color="808080" w:sz="4"/>
-              <w:right w:val="single" w:color="808080" w:sz="4"/>
-            </w:tcBorders>
-            <w:tcMar>
-              <w:top w:type="dxa" w:w="60"/>
-              <w:left w:type="dxa" w:w="100"/>
-              <w:bottom w:type="dxa" w:w="60"/>
-              <w:right w:type="dxa" w:w="100"/>
-            </w:tcMar>
-          </w:tcPr>
-          <w:p>
-            <w:pPr>
-              <w:spacing w:after="0"/>
-            </w:pPr>
-            <w:r>
-              <w:rPr>
-                <w:rFonts w:ascii="Times New Roman" w:cs="Times New Roman" w:eastAsia="Times New Roman" w:hAnsi="Times New Roman"/>
-                <w:sz w:val="20"/>
-                <w:szCs w:val="20"/>
-              </w:rPr>
-              <w:t xml:space="preserve">PRF-01 · Afel Anthonielle V. Quirao</w:t>
-            </w:r>
-          </w:p>
-        </w:tc>
-        <w:tc>
-          <w:tcPr>
-            <w:tcW w:type="dxa" w:w="5660"/>
-            <w:tcBorders>
-              <w:top w:val="single" w:color="808080" w:sz="4"/>
-              <w:left w:val="single" w:color="808080" w:sz="4"/>
-              <w:bottom w:val="single" w:color="808080" w:sz="4"/>
-              <w:right w:val="single" w:color="808080" w:sz="4"/>
-            </w:tcBorders>
-            <w:tcMar>
-              <w:top w:type="dxa" w:w="60"/>
-              <w:left w:type="dxa" w:w="100"/>
-              <w:bottom w:type="dxa" w:w="60"/>
-              <w:right w:type="dxa" w:w="100"/>
-            </w:tcMar>
-          </w:tcPr>
-          <w:p>
-            <w:pPr>
-              <w:spacing w:after="0"/>
-            </w:pPr>
-            <w:r>
-              <w:rPr>
-                <w:rFonts w:ascii="Times New Roman" w:cs="Times New Roman" w:eastAsia="Times New Roman" w:hAnsi="Times New Roman"/>
-                <w:sz w:val="20"/>
-                <w:szCs w:val="20"/>
-              </w:rPr>
-              <w:t xml:space="preserve">Needs a live capture while browsing; no results by close. The app stores no per-flow lag.</w:t>
-            </w:r>
-          </w:p>
-        </w:tc>
-      </w:tr>
-      <w:tr>
-        <w:trPr>
-          <w:cantSplit/>
-        </w:trPr>
-        <w:tc>
-          <w:tcPr>
-            <w:tcW w:type="dxa" w:w="1100"/>
-            <w:tcBorders>
-              <w:top w:val="single" w:color="808080" w:sz="4"/>
-              <w:left w:val="single" w:color="808080" w:sz="4"/>
-              <w:bottom w:val="single" w:color="808080" w:sz="4"/>
-              <w:right w:val="single" w:color="808080" w:sz="4"/>
-            </w:tcBorders>
-            <w:tcMar>
-              <w:top w:type="dxa" w:w="60"/>
-              <w:left w:type="dxa" w:w="100"/>
-              <w:bottom w:type="dxa" w:w="60"/>
-              <w:right w:type="dxa" w:w="100"/>
-            </w:tcMar>
-          </w:tcPr>
-          <w:p>
-            <w:pPr>
-              <w:spacing w:after="0"/>
-            </w:pPr>
-            <w:r>
-              <w:rPr>
-                <w:rFonts w:ascii="Times New Roman" w:cs="Times New Roman" w:eastAsia="Times New Roman" w:hAnsi="Times New Roman"/>
-                <w:sz w:val="20"/>
-                <w:szCs w:val="20"/>
-              </w:rPr>
-              <w:t xml:space="preserve">PRF-01.2</w:t>
-            </w:r>
-          </w:p>
-        </w:tc>
-        <w:tc>
-          <w:tcPr>
-            <w:tcW w:type="dxa" w:w="2600"/>
-            <w:tcBorders>
-              <w:top w:val="single" w:color="808080" w:sz="4"/>
-              <w:left w:val="single" w:color="808080" w:sz="4"/>
-              <w:bottom w:val="single" w:color="808080" w:sz="4"/>
-              <w:right w:val="single" w:color="808080" w:sz="4"/>
-            </w:tcBorders>
-            <w:tcMar>
-              <w:top w:type="dxa" w:w="60"/>
-              <w:left w:type="dxa" w:w="100"/>
-              <w:bottom w:type="dxa" w:w="60"/>
-              <w:right w:type="dxa" w:w="100"/>
-            </w:tcMar>
-          </w:tcPr>
-          <w:p>
-            <w:pPr>
-              <w:spacing w:after="0"/>
-            </w:pPr>
-            <w:r>
-              <w:rPr>
-                <w:rFonts w:ascii="Times New Roman" w:cs="Times New Roman" w:eastAsia="Times New Roman" w:hAnsi="Times New Roman"/>
-                <w:sz w:val="20"/>
-                <w:szCs w:val="20"/>
-              </w:rPr>
-              <w:t xml:space="preserve">PRF-01 · Afel Anthonielle V. Quirao</w:t>
-            </w:r>
-          </w:p>
-        </w:tc>
-        <w:tc>
-          <w:tcPr>
-            <w:tcW w:type="dxa" w:w="5660"/>
-            <w:tcBorders>
-              <w:top w:val="single" w:color="808080" w:sz="4"/>
-              <w:left w:val="single" w:color="808080" w:sz="4"/>
-              <w:bottom w:val="single" w:color="808080" w:sz="4"/>
-              <w:right w:val="single" w:color="808080" w:sz="4"/>
-            </w:tcBorders>
-            <w:tcMar>
-              <w:top w:type="dxa" w:w="60"/>
-              <w:left w:type="dxa" w:w="100"/>
-              <w:bottom w:type="dxa" w:w="60"/>
-              <w:right w:type="dxa" w:w="100"/>
-            </w:tcMar>
-          </w:tcPr>
-          <w:p>
-            <w:pPr>
-              <w:spacing w:after="0"/>
-            </w:pPr>
-            <w:r>
-              <w:rPr>
-                <w:rFonts w:ascii="Times New Roman" w:cs="Times New Roman" w:eastAsia="Times New Roman" w:hAnsi="Times New Roman"/>
-                <w:sz w:val="20"/>
-                <w:szCs w:val="20"/>
-              </w:rPr>
-              <w:t xml:space="preserve">Packet drop and the 30-minute soak need a live capture or long replay; no results by close.</w:t>
-            </w:r>
-          </w:p>
-        </w:tc>
-      </w:tr>
-      <w:tr>
-        <w:trPr>
-          <w:cantSplit/>
-        </w:trPr>
-        <w:tc>
-          <w:tcPr>
-            <w:tcW w:type="dxa" w:w="1100"/>
-            <w:tcBorders>
-              <w:top w:val="single" w:color="808080" w:sz="4"/>
-              <w:left w:val="single" w:color="808080" w:sz="4"/>
-              <w:bottom w:val="single" w:color="808080" w:sz="4"/>
-              <w:right w:val="single" w:color="808080" w:sz="4"/>
-            </w:tcBorders>
-            <w:tcMar>
-              <w:top w:type="dxa" w:w="60"/>
-              <w:left w:type="dxa" w:w="100"/>
-              <w:bottom w:type="dxa" w:w="60"/>
-              <w:right w:type="dxa" w:w="100"/>
-            </w:tcMar>
-          </w:tcPr>
-          <w:p>
-            <w:pPr>
-              <w:spacing w:after="0"/>
-            </w:pPr>
-            <w:r>
-              <w:rPr>
-                <w:rFonts w:ascii="Times New Roman" w:cs="Times New Roman" w:eastAsia="Times New Roman" w:hAnsi="Times New Roman"/>
-                <w:sz w:val="20"/>
-                <w:szCs w:val="20"/>
-              </w:rPr>
-              <w:t xml:space="preserve">TC-12</w:t>
-            </w:r>
-          </w:p>
-        </w:tc>
-        <w:tc>
-          <w:tcPr>
-            <w:tcW w:type="dxa" w:w="2600"/>
-            <w:tcBorders>
-              <w:top w:val="single" w:color="808080" w:sz="4"/>
-              <w:left w:val="single" w:color="808080" w:sz="4"/>
-              <w:bottom w:val="single" w:color="808080" w:sz="4"/>
-              <w:right w:val="single" w:color="808080" w:sz="4"/>
-            </w:tcBorders>
-            <w:tcMar>
-              <w:top w:type="dxa" w:w="60"/>
-              <w:left w:type="dxa" w:w="100"/>
-              <w:bottom w:type="dxa" w:w="60"/>
-              <w:right w:type="dxa" w:w="100"/>
-            </w:tcMar>
-          </w:tcPr>
-          <w:p>
-            <w:pPr>
-              <w:spacing w:after="0"/>
-            </w:pPr>
-            <w:r>
-              <w:rPr>
-                <w:rFonts w:ascii="Times New Roman" w:cs="Times New Roman" w:eastAsia="Times New Roman" w:hAnsi="Times New Roman"/>
-                <w:sz w:val="20"/>
-                <w:szCs w:val="20"/>
-              </w:rPr>
-              <w:t xml:space="preserve">USE-01 · Brynt M. Timtiman</w:t>
-            </w:r>
-          </w:p>
-        </w:tc>
-        <w:tc>
-          <w:tcPr>
-            <w:tcW w:type="dxa" w:w="5660"/>
-            <w:tcBorders>
-              <w:top w:val="single" w:color="808080" w:sz="4"/>
-              <w:left w:val="single" w:color="808080" w:sz="4"/>
-              <w:bottom w:val="single" w:color="808080" w:sz="4"/>
-              <w:right w:val="single" w:color="808080" w:sz="4"/>
-            </w:tcBorders>
-            <w:tcMar>
-              <w:top w:type="dxa" w:w="60"/>
-              <w:left w:type="dxa" w:w="100"/>
-              <w:bottom w:type="dxa" w:w="60"/>
-              <w:right w:type="dxa" w:w="100"/>
-            </w:tcMar>
-          </w:tcPr>
-          <w:p>
-            <w:pPr>
-              <w:spacing w:after="0"/>
-            </w:pPr>
-            <w:r>
-              <w:rPr>
-                <w:rFonts w:ascii="Times New Roman" w:cs="Times New Roman" w:eastAsia="Times New Roman" w:hAnsi="Times New Roman"/>
-                <w:sz w:val="20"/>
-                <w:szCs w:val="20"/>
-              </w:rPr>
-              <w:t xml:space="preserve">No page-width or Lighthouse results reached the Test Log (the board shows USE-01 as Done).</w:t>
-            </w:r>
-          </w:p>
-        </w:tc>
-      </w:tr>
-      <w:tr>
-        <w:trPr>
-          <w:cantSplit/>
-        </w:trPr>
-        <w:tc>
-          <w:tcPr>
-            <w:tcW w:type="dxa" w:w="1100"/>
-            <w:tcBorders>
-              <w:top w:val="single" w:color="808080" w:sz="4"/>
-              <w:left w:val="single" w:color="808080" w:sz="4"/>
-              <w:bottom w:val="single" w:color="808080" w:sz="4"/>
-              <w:right w:val="single" w:color="808080" w:sz="4"/>
-            </w:tcBorders>
-            <w:tcMar>
-              <w:top w:type="dxa" w:w="60"/>
-              <w:left w:type="dxa" w:w="100"/>
-              <w:bottom w:type="dxa" w:w="60"/>
-              <w:right w:type="dxa" w:w="100"/>
-            </w:tcMar>
-          </w:tcPr>
-          <w:p>
-            <w:pPr>
-              <w:spacing w:after="0"/>
-            </w:pPr>
-            <w:r>
-              <w:rPr>
-                <w:rFonts w:ascii="Times New Roman" w:cs="Times New Roman" w:eastAsia="Times New Roman" w:hAnsi="Times New Roman"/>
-                <w:sz w:val="20"/>
-                <w:szCs w:val="20"/>
-              </w:rPr>
-              <w:t xml:space="preserve">TC-14</w:t>
-            </w:r>
-          </w:p>
-        </w:tc>
-        <w:tc>
-          <w:tcPr>
-            <w:tcW w:type="dxa" w:w="2600"/>
-            <w:tcBorders>
-              <w:top w:val="single" w:color="808080" w:sz="4"/>
-              <w:left w:val="single" w:color="808080" w:sz="4"/>
-              <w:bottom w:val="single" w:color="808080" w:sz="4"/>
-              <w:right w:val="single" w:color="808080" w:sz="4"/>
-            </w:tcBorders>
-            <w:tcMar>
-              <w:top w:type="dxa" w:w="60"/>
-              <w:left w:type="dxa" w:w="100"/>
-              <w:bottom w:type="dxa" w:w="60"/>
-              <w:right w:type="dxa" w:w="100"/>
-            </w:tcMar>
-          </w:tcPr>
-          <w:p>
-            <w:pPr>
-              <w:spacing w:after="0"/>
-            </w:pPr>
-            <w:r>
-              <w:rPr>
-                <w:rFonts w:ascii="Times New Roman" w:cs="Times New Roman" w:eastAsia="Times New Roman" w:hAnsi="Times New Roman"/>
-                <w:sz w:val="20"/>
-                <w:szCs w:val="20"/>
-              </w:rPr>
-              <w:t xml:space="preserve">REG-01 · Cel Hendrix N. San Miguel</w:t>
-            </w:r>
-          </w:p>
-        </w:tc>
-        <w:tc>
-          <w:tcPr>
-            <w:tcW w:type="dxa" w:w="5660"/>
-            <w:tcBorders>
-              <w:top w:val="single" w:color="808080" w:sz="4"/>
-              <w:left w:val="single" w:color="808080" w:sz="4"/>
-              <w:bottom w:val="single" w:color="808080" w:sz="4"/>
-              <w:right w:val="single" w:color="808080" w:sz="4"/>
-            </w:tcBorders>
-            <w:tcMar>
-              <w:top w:type="dxa" w:w="60"/>
-              <w:left w:type="dxa" w:w="100"/>
-              <w:bottom w:type="dxa" w:w="60"/>
-              <w:right w:type="dxa" w:w="100"/>
-            </w:tcMar>
-          </w:tcPr>
-          <w:p>
-            <w:pPr>
-              <w:spacing w:after="0"/>
-            </w:pPr>
-            <w:r>
-              <w:rPr>
-                <w:rFonts w:ascii="Times New Roman" w:cs="Times New Roman" w:eastAsia="Times New Roman" w:hAnsi="Times New Roman"/>
-                <w:sz w:val="20"/>
-                <w:szCs w:val="20"/>
-              </w:rPr>
-              <w:t xml:space="preserve">The Lighthouse re-run of the page fixed for DEF-15 needs a signed-in browser; not done by close.</w:t>
-            </w:r>
-          </w:p>
-        </w:tc>
-      </w:tr>
-      <w:tr>
-        <w:trPr>
-          <w:cantSplit/>
-        </w:trPr>
-        <w:tc>
-          <w:tcPr>
-            <w:tcW w:type="dxa" w:w="1100"/>
-            <w:tcBorders>
-              <w:top w:val="single" w:color="808080" w:sz="4"/>
-              <w:left w:val="single" w:color="808080" w:sz="4"/>
-              <w:bottom w:val="single" w:color="808080" w:sz="4"/>
-              <w:right w:val="single" w:color="808080" w:sz="4"/>
-            </w:tcBorders>
-            <w:tcMar>
-              <w:top w:type="dxa" w:w="60"/>
-              <w:left w:type="dxa" w:w="100"/>
-              <w:bottom w:type="dxa" w:w="60"/>
-              <w:right w:type="dxa" w:w="100"/>
-            </w:tcMar>
-          </w:tcPr>
-          <w:p>
-            <w:pPr>
-              <w:spacing w:after="0"/>
-            </w:pPr>
-            <w:r>
-              <w:rPr>
-                <w:rFonts w:ascii="Times New Roman" w:cs="Times New Roman" w:eastAsia="Times New Roman" w:hAnsi="Times New Roman"/>
-                <w:sz w:val="20"/>
-                <w:szCs w:val="20"/>
-              </w:rPr>
-              <w:t xml:space="preserve">REG-01.2</w:t>
-            </w:r>
-          </w:p>
-        </w:tc>
-        <w:tc>
-          <w:tcPr>
-            <w:tcW w:type="dxa" w:w="2600"/>
-            <w:tcBorders>
-              <w:top w:val="single" w:color="808080" w:sz="4"/>
-              <w:left w:val="single" w:color="808080" w:sz="4"/>
-              <w:bottom w:val="single" w:color="808080" w:sz="4"/>
-              <w:right w:val="single" w:color="808080" w:sz="4"/>
-            </w:tcBorders>
-            <w:tcMar>
-              <w:top w:type="dxa" w:w="60"/>
-              <w:left w:type="dxa" w:w="100"/>
-              <w:bottom w:type="dxa" w:w="60"/>
-              <w:right w:type="dxa" w:w="100"/>
-            </w:tcMar>
-          </w:tcPr>
-          <w:p>
-            <w:pPr>
-              <w:spacing w:after="0"/>
-            </w:pPr>
-            <w:r>
-              <w:rPr>
-                <w:rFonts w:ascii="Times New Roman" w:cs="Times New Roman" w:eastAsia="Times New Roman" w:hAnsi="Times New Roman"/>
-                <w:sz w:val="20"/>
-                <w:szCs w:val="20"/>
-              </w:rPr>
-              <w:t xml:space="preserve">REG-01 · Cel Hendrix N. San Miguel</w:t>
-            </w:r>
-          </w:p>
-        </w:tc>
-        <w:tc>
-          <w:tcPr>
-            <w:tcW w:type="dxa" w:w="5660"/>
-            <w:tcBorders>
-              <w:top w:val="single" w:color="808080" w:sz="4"/>
-              <w:left w:val="single" w:color="808080" w:sz="4"/>
-              <w:bottom w:val="single" w:color="808080" w:sz="4"/>
-              <w:right w:val="single" w:color="808080" w:sz="4"/>
-            </w:tcBorders>
-            <w:tcMar>
-              <w:top w:type="dxa" w:w="60"/>
-              <w:left w:type="dxa" w:w="100"/>
-              <w:bottom w:type="dxa" w:w="60"/>
-              <w:right w:type="dxa" w:w="100"/>
-            </w:tcMar>
-          </w:tcPr>
-          <w:p>
-            <w:pPr>
-              <w:spacing w:after="0"/>
-            </w:pPr>
-            <w:r>
-              <w:rPr>
-                <w:rFonts w:ascii="Times New Roman" w:cs="Times New Roman" w:eastAsia="Times New Roman" w:hAnsi="Times New Roman"/>
-                <w:sz w:val="20"/>
-                <w:szCs w:val="20"/>
-              </w:rPr>
-              <w:t xml:space="preserve">The SMK-01 re-run needs a person at the app; not done by close.</w:t>
-            </w:r>
-          </w:p>
-        </w:tc>
-      </w:tr>
-      <w:tr>
-        <w:trPr>
-          <w:cantSplit/>
-        </w:trPr>
-        <w:tc>
-          <w:tcPr>
-            <w:tcW w:type="dxa" w:w="1100"/>
-            <w:tcBorders>
-              <w:top w:val="single" w:color="808080" w:sz="4"/>
-              <w:left w:val="single" w:color="808080" w:sz="4"/>
-              <w:bottom w:val="single" w:color="808080" w:sz="4"/>
-              <w:right w:val="single" w:color="808080" w:sz="4"/>
-            </w:tcBorders>
-            <w:tcMar>
-              <w:top w:type="dxa" w:w="60"/>
-              <w:left w:type="dxa" w:w="100"/>
-              <w:bottom w:type="dxa" w:w="60"/>
-              <w:right w:type="dxa" w:w="100"/>
-            </w:tcMar>
-          </w:tcPr>
-          <w:p>
-            <w:pPr>
-              <w:spacing w:after="0"/>
-            </w:pPr>
-            <w:r>
-              <w:rPr>
-                <w:rFonts w:ascii="Times New Roman" w:cs="Times New Roman" w:eastAsia="Times New Roman" w:hAnsi="Times New Roman"/>
-                <w:sz w:val="20"/>
-                <w:szCs w:val="20"/>
-              </w:rPr>
               <w:t xml:space="preserve">TC-15</w:t>
             </w:r>
           </w:p>
@@ -17693,7 +17583,7 @@
                 <w:sz w:val="20"/>
                 <w:szCs w:val="20"/>
               </w:rPr>
-              <w:t xml:space="preserve">80% of executed test cases (8 of 10: TC-01, TC-02, TC-04, TC-08, TC-09, TC-10, TC-13, TC-16 passed; TC-03 and TC-05 failed; TC-06, TC-07, TC-11, TC-12, TC-14, TC-15 not executed). 80.4% of executed Test Log rows (45 Pass of 56).</w:t>
+              <w:t xml:space="preserve">69% of executed test cases (9 of 13: TC-01, TC-02, TC-04, TC-08, TC-09, TC-10, TC-12, TC-13, TC-16 passed; TC-03, TC-05, TC-11 and TC-14 failed - TC-14 because the DEF-12 re-test still fails; TC-06, TC-07, TC-15 not executed). 76.7% of executed Test Log rows (66 Pass of 86).</w:t>
             </w:r>
           </w:p>
         </w:tc>
@@ -18568,7 +18458,7 @@
                 <w:sz w:val="20"/>
                 <w:szCs w:val="20"/>
               </w:rPr>
-              <w:t xml:space="preserve">Events per second not met (about 1.9/s, DEF-11); lag, packet drop and soak not measured this cycle; no written waiver</w:t>
+              <w:t xml:space="preserve">Lag p95 not met (895.6 ms, DEF-17) and events per second not met (1.65-1.92/s, DEF-11); packet drop, soak CPU and soak RAM met; no written waiver</w:t>
             </w:r>
           </w:p>
         </w:tc>
@@ -18693,7 +18583,7 @@
                 <w:sz w:val="20"/>
                 <w:szCs w:val="20"/>
               </w:rPr>
-              <w:t xml:space="preserve">11 Low/Medium defects open (DEF-01, 02, 03, 08, 09, 10, 11, 12, 13, 14, 15). A workaround is written only in DEF-02 (docker start the Edge Runtime) and DEF-08 (train on 15-feature CSVs); suggested workarounds are in the Completion Report; no Product Owner sign-off yet</w:t>
+              <w:t xml:space="preserve">6 Low/Medium defects open (DEF-08, 10, 11, 12, 16, 17); DEF-01, 02, 03, 09, 13, 14, 15 and 18 fixed and closed in REG-01. DEF-08 and DEF-12 are fixed in part and wait for a decision; DEF-16 waits for its UI re-test on 128855e. Workaround written in DEF-08 (train on 15-feature CSVs); no Product Owner sign-off yet</w:t>
             </w:r>
           </w:p>
         </w:tc>
@@ -18943,7 +18833,7 @@
                 <w:sz w:val="20"/>
                 <w:szCs w:val="20"/>
               </w:rPr>
-              <w:t xml:space="preserve">Not measured: TC-11 not executed. The app stores no flow end time or per-flow lag. (Pilot, different budget: average 13.1 s on PC B including the 15 s idle timeout.)</w:t>
+              <w:t xml:space="preserve">895.6 ms p95 (p50 388.9 ms) over 32 flows ended by FIN/RST in a 90 s live capture of ordinary browsing on PC A</w:t>
             </w:r>
           </w:p>
         </w:tc>
@@ -18973,7 +18863,7 @@
                 <w:sz w:val="20"/>
                 <w:szCs w:val="20"/>
               </w:rPr>
-              <w:t xml:space="preserve">Not met (not measured)</w:t>
+              <w:t xml:space="preserve">Not met</w:t>
             </w:r>
           </w:p>
         </w:tc>
@@ -19068,7 +18958,7 @@
                 <w:sz w:val="20"/>
                 <w:szCs w:val="20"/>
               </w:rPr>
-              <w:t xml:space="preserve">1.92 events/s (TC-09 replay, 202 events in 105 s); about 2.0 flows/s (SMK-01 replay); paced source, max 2.86/s</w:t>
+              <w:t xml:space="preserve">1.65 flows/s over the 30-minute Fast replay; 1.92 events/s (TC-09 replay, 202 events in 105 s); paced source, max 2.86/s</w:t>
             </w:r>
           </w:p>
         </w:tc>
@@ -19193,7 +19083,7 @@
                 <w:sz w:val="20"/>
                 <w:szCs w:val="20"/>
               </w:rPr>
-              <w:t xml:space="preserve">Not measured this cycle (pilot: 0% - 0 of 848, 0 of 2,810, 0 of 119,100, 0 of 740 packets)</w:t>
+              <w:t xml:space="preserve">0% (0 of 8,721 packets in the 90 s live capture)</w:t>
             </w:r>
           </w:p>
         </w:tc>
@@ -19223,7 +19113,7 @@
                 <w:sz w:val="20"/>
                 <w:szCs w:val="20"/>
               </w:rPr>
-              <w:t xml:space="preserve">Not met (not measured)</w:t>
+              <w:t xml:space="preserve">Met</w:t>
             </w:r>
           </w:p>
         </w:tc>
@@ -19318,7 +19208,7 @@
                 <w:sz w:val="20"/>
                 <w:szCs w:val="20"/>
               </w:rPr>
-              <w:t xml:space="preserve">Not measured this cycle (pilot, different budget: peak 24.5% PC A, 6.3% PC B)</w:t>
+              <w:t xml:space="preserve">Max 8.03%, mean 7.54% of the machine (60 samples, 06:28-06:57)</w:t>
             </w:r>
           </w:p>
         </w:tc>
@@ -19348,7 +19238,7 @@
                 <w:sz w:val="20"/>
                 <w:szCs w:val="20"/>
               </w:rPr>
-              <w:t xml:space="preserve">Not met (not measured)</w:t>
+              <w:t xml:space="preserve">Met</w:t>
             </w:r>
           </w:p>
         </w:tc>
@@ -19443,7 +19333,7 @@
                 <w:sz w:val="20"/>
                 <w:szCs w:val="20"/>
               </w:rPr>
-              <w:t xml:space="preserve">Not measured this cycle (pilot: peak 294 MB PC A, 108 MB PC B)</w:t>
+              <w:t xml:space="preserve">Max 352.2 MB; 322.0 MB at the end; whole-run trend -0.1 MB/min (a climb of about 29 MB from 06:32 to 06:52 then flat - a longer soak is suggested)</w:t>
             </w:r>
           </w:p>
         </w:tc>
@@ -19473,7 +19363,7 @@
                 <w:sz w:val="20"/>
                 <w:szCs w:val="20"/>
               </w:rPr>
-              <w:t xml:space="preserve">Not met (not measured)</w:t>
+              <w:t xml:space="preserve">Met</w:t>
             </w:r>
           </w:p>
         </w:tc>
@@ -19543,7 +19433,7 @@
           <w:i w:val="0"/>
           <w:sz w:val="22"/>
         </w:rPr>
-        <w:t xml:space="preserve">Live detection unvalidated. </w:t>
+        <w:t xml:space="preserve">Live detection accuracy. </w:t>
       </w:r>
       <w:r>
         <w:rPr>
@@ -19552,7 +19442,7 @@
           <w:i w:val="0"/>
           <w:sz w:val="22"/>
         </w:rPr>
-        <w:t>Accuracy on real Wi-Fi traffic was not measured (pilot finding 12 and limit L6), and live lag, packet drop and the soak were not measured this cycle.</w:t>
+        <w:t>Accuracy on real Wi-Fi traffic is not established: 67% of ordinary browsing was flagged as attack in today's live capture (pilot finding 12, limit L6), consistent with DEF-06.</w:t>
       </w:r>
     </w:p>
     <w:p>
@@ -19571,7 +19461,7 @@
           <w:i w:val="0"/>
           <w:sz w:val="22"/>
         </w:rPr>
-        <w:t xml:space="preserve">Input validation (DEF-12, DEF-13). </w:t>
+        <w:t xml:space="preserve">Missing input at the server (DEF-12). </w:t>
       </w:r>
       <w:r>
         <w:rPr>
@@ -19580,7 +19470,7 @@
           <w:i w:val="0"/>
           <w:sz w:val="22"/>
         </w:rPr>
-        <w:t>Missing values are filled with defaults and negative counts are accepted. Workaround: use the Manual Prediction form, which blocks empty fields, and enter only non-negative counts.</w:t>
+        <w:t>Negative and out-of-range values are now refused, but a missing numeric field sent to the server is filled with a training default and stored. Workaround: use the Manual Prediction form, which blocks empty fields.</w:t>
       </w:r>
     </w:p>
     <w:p>
@@ -19599,7 +19489,7 @@
           <w:i w:val="0"/>
           <w:sz w:val="22"/>
         </w:rPr>
-        <w:t xml:space="preserve">Training on raw files (DEF-08). </w:t>
+        <w:t xml:space="preserve">Local deploy without a schema check (DEF-08). </w:t>
       </w:r>
       <w:r>
         <w:rPr>
@@ -19608,7 +19498,7 @@
           <w:i w:val="0"/>
           <w:sz w:val="22"/>
         </w:rPr>
-        <w:t>Workaround: train only on CSVs with the 15 flow features and a label, as the bundled datasets are.</w:t>
+        <w:t>Training on the raw UNSW file now uses only the 15 flow features. Workaround for other files: train only on CSVs with the 15 flow features and a label, as the bundled datasets are.</w:t>
       </w:r>
     </w:p>
     <w:p>
@@ -19627,7 +19517,7 @@
           <w:i w:val="0"/>
           <w:sz w:val="22"/>
         </w:rPr>
-        <w:t xml:space="preserve">CI is red (DEF-01, DEF-03). </w:t>
+        <w:t xml:space="preserve">UTC labels (DEF-16). </w:t>
       </w:r>
       <w:r>
         <w:rPr>
@@ -19636,7 +19526,7 @@
           <w:i w:val="0"/>
           <w:sz w:val="22"/>
         </w:rPr>
-        <w:t>Workaround: run scripts/run_test_suites.py locally before merging; pin python-version 3.14.6 in .github/workflows/ci.yml.</w:t>
+        <w:t>Fixed in 128855e and covered by automated tests; the in-app check on that build is still to be done. Until then, read unlabelled times as UTC (Asia/Manila is UTC+8).</w:t>
       </w:r>
     </w:p>
     <w:p>
@@ -19655,7 +19545,7 @@
           <w:i w:val="0"/>
           <w:sz w:val="22"/>
         </w:rPr>
-        <w:t xml:space="preserve">Local test stack (DEF-02). </w:t>
+        <w:t xml:space="preserve">Live lag (DEF-17). </w:t>
       </w:r>
       <w:r>
         <w:rPr>
@@ -19664,35 +19554,7 @@
           <w:i w:val="0"/>
           <w:sz w:val="22"/>
         </w:rPr>
-        <w:t>Workaround: after supabase start, run docker start supabase_edge_runtime_AlgoGuard.</w:t>
-      </w:r>
-    </w:p>
-    <w:p>
-      <w:pPr>
-        <w:pStyle w:val="ListParagraph"/>
-        <w:numPr>
-          <w:ilvl w:val="0"/>
-          <w:numId w:val="2"/>
-        </w:numPr>
-        <w:spacing w:after="40"/>
-      </w:pPr>
-      <w:r>
-        <w:rPr>
-          <w:rFonts w:ascii="Times New Roman" w:hAnsi="Times New Roman"/>
-          <w:b/>
-          <w:i w:val="0"/>
-          <w:sz w:val="22"/>
-        </w:rPr>
-        <w:t xml:space="preserve">Status wording (DEF-09) and truncated captures (DEF-14). </w:t>
-      </w:r>
-      <w:r>
-        <w:rPr>
-          <w:rFonts w:ascii="Times New Roman" w:hAnsi="Times New Roman"/>
-          <w:b w:val="0"/>
-          <w:i w:val="0"/>
-          <w:sz w:val="22"/>
-        </w:rPr>
-        <w:t>Workaround: check the Predict or Live Monitor page for model status; confirm capture files are complete before replay.</w:t>
+        <w:t>Flows ended by FIN/RST reach a verdict in 389 ms (median) but 896 ms at p95, above the 500 ms budget; roughly half is model time.</w:t>
       </w:r>
     </w:p>
     <w:p>
@@ -19720,7 +19582,35 @@
           <w:i w:val="0"/>
           <w:sz w:val="22"/>
         </w:rPr>
-        <w:t>Paced sources cannot show 20 events/s; a sustained-load harness is needed. One live run had a 24 s upload p95 (cause not identified).</w:t>
+        <w:t>Paced sources cannot show 20 events/s; a sustained-load harness is needed. One pilot live run had a 24 s upload p95 (cause not identified).</w:t>
+      </w:r>
+    </w:p>
+    <w:p>
+      <w:pPr>
+        <w:pStyle w:val="ListParagraph"/>
+        <w:numPr>
+          <w:ilvl w:val="0"/>
+          <w:numId w:val="2"/>
+        </w:numPr>
+        <w:spacing w:after="40"/>
+      </w:pPr>
+      <w:r>
+        <w:rPr>
+          <w:rFonts w:ascii="Times New Roman" w:hAnsi="Times New Roman"/>
+          <w:b/>
+          <w:i w:val="0"/>
+          <w:sz w:val="22"/>
+        </w:rPr>
+        <w:t xml:space="preserve">Memory over longer runs. </w:t>
+      </w:r>
+      <w:r>
+        <w:rPr>
+          <w:rFonts w:ascii="Times New Roman" w:hAnsi="Times New Roman"/>
+          <w:b w:val="0"/>
+          <w:i w:val="0"/>
+          <w:sz w:val="22"/>
+        </w:rPr>
+        <w:t>Memory climbed about 29 MB in the middle of the 30-minute soak before levelling off; a multi-hour soak would rule out a slow leak.</w:t>
       </w:r>
     </w:p>
     <w:p>
@@ -19915,6 +19805,44 @@
           <w:i w:val="0"/>
           <w:sz w:val="22"/>
         </w:rPr>
+        <w:t>Restart the app on the final build before the last regression runs; the final UI check ran on the earlier fix build because the app had not been restarted.</w:t>
+      </w:r>
+    </w:p>
+    <w:p>
+      <w:pPr>
+        <w:pStyle w:val="ListParagraph"/>
+        <w:numPr>
+          <w:ilvl w:val="0"/>
+          <w:numId w:val="2"/>
+        </w:numPr>
+        <w:spacing w:after="40"/>
+      </w:pPr>
+      <w:r>
+        <w:rPr>
+          <w:rFonts w:ascii="Times New Roman" w:hAnsi="Times New Roman"/>
+          <w:b w:val="0"/>
+          <w:i w:val="0"/>
+          <w:sz w:val="22"/>
+        </w:rPr>
+        <w:t>Check every page for unlabelled times, not only the pages named in the defect; the first DEF-16 fix missed four places.</w:t>
+      </w:r>
+    </w:p>
+    <w:p>
+      <w:pPr>
+        <w:pStyle w:val="ListParagraph"/>
+        <w:numPr>
+          <w:ilvl w:val="0"/>
+          <w:numId w:val="2"/>
+        </w:numPr>
+        <w:spacing w:after="40"/>
+      </w:pPr>
+      <w:r>
+        <w:rPr>
+          <w:rFonts w:ascii="Times New Roman" w:hAnsi="Times New Roman"/>
+          <w:b w:val="0"/>
+          <w:i w:val="0"/>
+          <w:sz w:val="22"/>
+        </w:rPr>
         <w:t>Align the pilot and plan budgets; the Stage 5F targets differ from section 3.4.</w:t>
       </w:r>
     </w:p>
@@ -20045,6 +19973,44 @@
           <w:sz w:val="22"/>
         </w:rPr>
         <w:t>2026-10-19 Lesson: CI lints the whole repository (ruff check .), so evidence scripts committed under test-results/ count too. Two pushed scripts had three lines over 100 characters and made CI fail at Lint (runs 39231611272, 39232218107) instead of at Unit tests; fixed in a578c9b (formatting only), and run 39232688772 on 22bd1d0 is back to Lint and Type check green, Unit tests failing as in DEF-01/DEF-03.</w:t>
+      </w:r>
+    </w:p>
+    <w:p>
+      <w:pPr>
+        <w:pStyle w:val="ListParagraph"/>
+        <w:numPr>
+          <w:ilvl w:val="0"/>
+          <w:numId w:val="2"/>
+        </w:numPr>
+        <w:spacing w:after="40"/>
+      </w:pPr>
+      <w:r>
+        <w:rPr>
+          <w:rFonts w:ascii="Times New Roman" w:hAnsi="Times New Roman"/>
+          <w:b w:val="0"/>
+          <w:i w:val="0"/>
+          <w:sz w:val="22"/>
+        </w:rPr>
+        <w:t>2026-10-20 Product Owner decision (relayed): the Lead Architect reported that Pauleen Joy O. Gomez gave permission to accept the build. Recorded as relayed, not signed; she has not executed the UAT scenarios (TC-15) and the plan's 'zero open Critical or High' criterion cannot be waived, so the acceptance is 'accept with conditions' pending her signature on the UAT sheet and the Completion Report.</w:t>
+      </w:r>
+    </w:p>
+    <w:p>
+      <w:pPr>
+        <w:pStyle w:val="ListParagraph"/>
+        <w:numPr>
+          <w:ilvl w:val="0"/>
+          <w:numId w:val="2"/>
+        </w:numPr>
+        <w:spacing w:after="40"/>
+      </w:pPr>
+      <w:r>
+        <w:rPr>
+          <w:rFonts w:ascii="Times New Roman" w:hAnsi="Times New Roman"/>
+          <w:b w:val="0"/>
+          <w:i w:val="0"/>
+          <w:sz w:val="22"/>
+        </w:rPr>
+        <w:t>2026-10-20 Fixes: at the Lead Architect's request the Low/Medium product and CI defects were fixed separately from the test runs (branch cycle1-fixes, nine commits eecaac7..128855e on main) and verified in REG-01 on the fix builds 0480899 and 128855e. Not changed, pending a decision: missing numeric fields are still filled with training defaults at the server (DEF-12) and local --deploy has no feature-schema check (DEF-08). Model defects DEF-04..07, and DEF-10, 11, 17 are left for cycle 2.</w:t>
       </w:r>
     </w:p>
     <w:p>

</xml_diff>

<commit_message>
docs: finalise the cycle 1 status and completion reports for signature (DOC-05, DOC-06)
</commit_message>
<xml_diff>
--- a/docs/testing/cycle-1/3 - AlgoGuard Test Completion Report v1.0.docx
+++ b/docs/testing/cycle-1/3 - AlgoGuard Test Completion Report v1.0.docx
@@ -172,7 +172,7 @@
           <w:i w:val="0"/>
           <w:sz w:val="22"/>
         </w:rPr>
-        <w:t>AlgoGuard-CSThesis/AlgoGuard, branch main, product code 940e082 (executed on test tooling commit dafe5e5); release candidate 503cb9b; fix build 0480899; final build 128855e (CI green on ccbadd8)</w:t>
+        <w:t>AlgoGuard-CSThesis/AlgoGuard, branch main, product code 940e082 (executed on test tooling commit dafe5e5); release candidate 503cb9b; fix builds 0480899 and 128855e; final build 213d0be (CI green)</w:t>
       </w:r>
     </w:p>
     <w:p>
@@ -1274,7 +1274,7 @@
           <w:i w:val="0"/>
           <w:sz w:val="22"/>
         </w:rPr>
-        <w:t>Testing ran on PC A from 2026-10-19 10:45 to 2026-10-20 09:47 (Asia/Manila), two days after the planned window. The Test Log holds 98 executions — 66 passed, 20 failed, 12 not executed — and 18 defects (4 High, 7 Medium, 7 Low, none Critical); 8 were fixed, re-tested and closed during the cycle.</w:t>
+        <w:t>Testing ran on PC A from 2026-10-19 10:45 to 2026-10-20 10:23 (Asia/Manila), two days after the planned window. The Test Log holds 106 executions — 74 passed, 20 failed, 12 not executed — and 18 defects (4 High, 7 Medium, 7 Low, none Critical); 11 were fixed, re-tested and closed during the cycle.</w:t>
       </w:r>
     </w:p>
     <w:p>
@@ -1741,7 +1741,7 @@
                 <w:sz w:val="20"/>
                 <w:szCs w:val="20"/>
               </w:rPr>
-              <w:t xml:space="preserve">3 / 3 / 0</w:t>
+              <w:t xml:space="preserve">5 / 3 / 0</w:t>
             </w:r>
           </w:p>
         </w:tc>
@@ -2391,7 +2391,7 @@
                 <w:sz w:val="20"/>
                 <w:szCs w:val="20"/>
               </w:rPr>
-              <w:t xml:space="preserve">TC-03 fail: model A misses accuracy, F1, false-positive rate and ROC-AUC on unseen data (DEF-04 to DEF-07); recall met; reproducible; model B comparison done (raw-column leak DEF-08, now fixed for training; local deploy check still open).</w:t>
+              <w:t xml:space="preserve">TC-03 fail: model A misses accuracy, F1, false-positive rate and ROC-AUC on unseen data (DEF-04 to DEF-07); recall met; reproducible; model B comparison done (raw-column leak DEF-08: id and attack_cat are now never used for training, and train.py warns about models that cannot run on captured traffic; closed).</w:t>
             </w:r>
           </w:p>
         </w:tc>
@@ -2516,7 +2516,7 @@
                 <w:sz w:val="20"/>
                 <w:szCs w:val="20"/>
               </w:rPr>
-              <w:t xml:space="preserve">6 / 5 / 2</w:t>
+              <w:t xml:space="preserve">7 / 5 / 2</w:t>
             </w:r>
           </w:p>
         </w:tc>
@@ -2546,7 +2546,7 @@
                 <w:sz w:val="20"/>
                 <w:szCs w:val="20"/>
               </w:rPr>
-              <w:t xml:space="preserve">PCAP replay, live capture (0 packets dropped, own traffic excluded) and the 300-event cap pass; truncated PCAP now refused (DEF-14 closed); 1e308 and negative input now refused in plain language (DEF-13 closed); missing fields still filled with defaults at the server (DEF-12 open, decision needed).</w:t>
+              <w:t xml:space="preserve">PCAP replay, live capture (0 packets dropped, own traffic excluded) and the 300-event cap pass; truncated PCAP now refused (DEF-14 closed); missing, empty, out-of-range and negative input now refused in plain language with nothing stored (DEF-12, DEF-13 closed).</w:t>
             </w:r>
           </w:p>
         </w:tc>
@@ -2576,7 +2576,7 @@
                 <w:sz w:val="20"/>
                 <w:szCs w:val="20"/>
               </w:rPr>
-              <w:t xml:space="preserve">In Progress</w:t>
+              <w:t xml:space="preserve">Done</w:t>
             </w:r>
           </w:p>
         </w:tc>
@@ -3136,7 +3136,7 @@
                 <w:sz w:val="20"/>
                 <w:szCs w:val="20"/>
               </w:rPr>
-              <w:t xml:space="preserve">3 / 3 / 1</w:t>
+              <w:t xml:space="preserve">4 / 3 / 1</w:t>
             </w:r>
           </w:p>
         </w:tc>
@@ -3166,7 +3166,7 @@
                 <w:sz w:val="20"/>
                 <w:szCs w:val="20"/>
               </w:rPr>
-              <w:t xml:space="preserve">No sideways scrolling at 1366 and 390 px (TC-12), keyboard and labels pass, Lighthouse Accessibility 100 on three pages; DEF-15 closed; plain-language issues DEF-13 and DEF-18 fixed and closed, DEF-16 (UTC labels) waiting for its UI re-test.</w:t>
+              <w:t xml:space="preserve">No sideways scrolling at 1366 and 390 px (TC-12), keyboard and labels pass, Lighthouse Accessibility 100 on three pages; DEF-15 closed; plain-language issues DEF-13, DEF-16 (UTC labels) and DEF-18 fixed and closed.</w:t>
             </w:r>
           </w:p>
         </w:tc>
@@ -3291,7 +3291,7 @@
                 <w:sz w:val="20"/>
                 <w:szCs w:val="20"/>
               </w:rPr>
-              <w:t xml:space="preserve">10 / 1 / 2</w:t>
+              <w:t xml:space="preserve">14 / 1 / 2</w:t>
             </w:r>
           </w:p>
         </w:tc>
@@ -3321,7 +3321,7 @@
                 <w:sz w:val="20"/>
                 <w:szCs w:val="20"/>
               </w:rPr>
-              <w:t xml:space="preserve">Full suite passed on 503cb9b, the fix build 0480899 and the final build 128855e; CI green; DEF-01, 02, 03, 09, 13, 14, 15, 18 re-tested and closed; DEF-08 and DEF-12 partly fixed; smoke passed on 0480899 but was not re-run on 128855e.</w:t>
+              <w:t xml:space="preserve">Full suite passed on 503cb9b, 0480899, 128855e and the final build 213d0be; CI green; all eleven fixed defects re-tested and closed; SMK-01 passed on the final build.</w:t>
             </w:r>
           </w:p>
         </w:tc>
@@ -3351,7 +3351,7 @@
                 <w:sz w:val="20"/>
                 <w:szCs w:val="20"/>
               </w:rPr>
-              <w:t xml:space="preserve">To Do</w:t>
+              <w:t xml:space="preserve">Done</w:t>
             </w:r>
           </w:p>
         </w:tc>
@@ -4292,7 +4292,7 @@
                 <w:sz w:val="20"/>
                 <w:szCs w:val="20"/>
               </w:rPr>
-              <w:t xml:space="preserve">Fail (DEF-12)</w:t>
+              <w:t xml:space="preserve">Pass (DEF-12)</w:t>
             </w:r>
           </w:p>
         </w:tc>
@@ -4322,7 +4322,7 @@
                 <w:sz w:val="20"/>
                 <w:szCs w:val="20"/>
               </w:rPr>
-              <w:t xml:space="preserve">Fix build: 1e308 and negative values refused in plain language, nothing stored; missing numeric fields still filled with defaults at the server (DEF-12).</w:t>
+              <w:t xml:space="preserve">Final build: missing or empty fields, 'abc', 1e308 and negative values all refused in plain language; nothing stored.</w:t>
             </w:r>
           </w:p>
         </w:tc>
@@ -5417,7 +5417,7 @@
                 <w:sz w:val="20"/>
                 <w:szCs w:val="20"/>
               </w:rPr>
-              <w:t xml:space="preserve">Fail (DEF-12, DEF-13, DEF-14, DEF-16, DEF-18)</w:t>
+              <w:t xml:space="preserve">Pass (DEF-12, DEF-16)</w:t>
             </w:r>
           </w:p>
         </w:tc>
@@ -5447,7 +5447,7 @@
                 <w:sz w:val="20"/>
                 <w:szCs w:val="20"/>
               </w:rPr>
-              <w:t xml:space="preserve">Eight fixed defects re-tested and closed; DEF-12 still fails on missing fields; DEF-16 waits for a UI re-test on 128855e.</w:t>
+              <w:t xml:space="preserve">Eleven fixed defects re-tested and closed (DEF-01, 02, 03, 08, 09, 12, 13, 14, 15, 16, 18).</w:t>
             </w:r>
           </w:p>
         </w:tc>
@@ -12809,7 +12809,7 @@
                 <w:sz w:val="20"/>
                 <w:szCs w:val="20"/>
               </w:rPr>
-              <w:t xml:space="preserve">5</w:t>
+              <w:t xml:space="preserve">3</w:t>
             </w:r>
           </w:p>
         </w:tc>
@@ -12839,7 +12839,7 @@
                 <w:sz w:val="20"/>
                 <w:szCs w:val="20"/>
               </w:rPr>
-              <w:t xml:space="preserve">2</w:t>
+              <w:t xml:space="preserve">4</w:t>
             </w:r>
           </w:p>
         </w:tc>
@@ -12934,7 +12934,7 @@
                 <w:sz w:val="20"/>
                 <w:szCs w:val="20"/>
               </w:rPr>
-              <w:t xml:space="preserve">1</w:t>
+              <w:t xml:space="preserve">0</w:t>
             </w:r>
           </w:p>
         </w:tc>
@@ -12964,7 +12964,7 @@
                 <w:sz w:val="20"/>
                 <w:szCs w:val="20"/>
               </w:rPr>
-              <w:t xml:space="preserve">6</w:t>
+              <w:t xml:space="preserve">7</w:t>
             </w:r>
           </w:p>
         </w:tc>
@@ -14644,7 +14644,7 @@
                 <w:sz w:val="20"/>
                 <w:szCs w:val="20"/>
               </w:rPr>
-              <w:t xml:space="preserve">Open</w:t>
+              <w:t xml:space="preserve">Closed</w:t>
             </w:r>
           </w:p>
         </w:tc>
@@ -15384,7 +15384,7 @@
                 <w:sz w:val="20"/>
                 <w:szCs w:val="20"/>
               </w:rPr>
-              <w:t xml:space="preserve">Open</w:t>
+              <w:t xml:space="preserve">Closed</w:t>
             </w:r>
           </w:p>
         </w:tc>
@@ -16124,7 +16124,7 @@
                 <w:sz w:val="20"/>
                 <w:szCs w:val="20"/>
               </w:rPr>
-              <w:t xml:space="preserve">Open</w:t>
+              <w:t xml:space="preserve">Closed</w:t>
             </w:r>
           </w:p>
         </w:tc>
@@ -17583,7 +17583,7 @@
                 <w:sz w:val="20"/>
                 <w:szCs w:val="20"/>
               </w:rPr>
-              <w:t xml:space="preserve">69% of executed test cases (9 of 13: TC-01, TC-02, TC-04, TC-08, TC-09, TC-10, TC-12, TC-13, TC-16 passed; TC-03, TC-05, TC-11 and TC-14 failed - TC-14 because the DEF-12 re-test still fails; TC-06, TC-07, TC-15 not executed). 76.7% of executed Test Log rows (66 Pass of 86).</w:t>
+              <w:t xml:space="preserve">84.6% of executed test cases (11 of 13: TC-01, TC-02, TC-04, TC-05, TC-08, TC-09, TC-10, TC-12, TC-13, TC-14, TC-16 passed on their latest run; TC-03 and TC-11 failed; TC-06, TC-07, TC-15 not executed). 78.7% of executed Test Log rows (74 Pass of 94, earlier failed runs included).</w:t>
             </w:r>
           </w:p>
         </w:tc>
@@ -18583,7 +18583,7 @@
                 <w:sz w:val="20"/>
                 <w:szCs w:val="20"/>
               </w:rPr>
-              <w:t xml:space="preserve">6 Low/Medium defects open (DEF-08, 10, 11, 12, 16, 17); DEF-01, 02, 03, 09, 13, 14, 15 and 18 fixed and closed in REG-01. DEF-08 and DEF-12 are fixed in part and wait for a decision; DEF-16 waits for its UI re-test on 128855e. Workaround written in DEF-08 (train on 15-feature CSVs); no Product Owner sign-off yet</w:t>
+              <w:t xml:space="preserve">3 Medium defects open (DEF-10, 11, 17 - throughput and lag limits, for cycle 2), without written workarounds; 11 Low/Medium defects (DEF-01, 02, 03, 08, 09, 12, 13, 14, 15, 16, 18) fixed, re-tested and closed. No Product Owner sign-off yet</w:t>
             </w:r>
           </w:p>
         </w:tc>
@@ -19461,7 +19461,7 @@
           <w:i w:val="0"/>
           <w:sz w:val="22"/>
         </w:rPr>
-        <w:t xml:space="preserve">Missing input at the server (DEF-12). </w:t>
+        <w:t xml:space="preserve">API change (DEF-12, closed). </w:t>
       </w:r>
       <w:r>
         <w:rPr>
@@ -19470,7 +19470,7 @@
           <w:i w:val="0"/>
           <w:sz w:val="22"/>
         </w:rPr>
-        <w:t>Negative and out-of-range values are now refused, but a missing numeric field sent to the server is filled with a training default and stored. Workaround: use the Manual Prediction form, which blocks empty fields.</w:t>
+        <w:t>POST /predict now refuses omitted, null or empty fields instead of filling in training defaults; any script that relied on partial input must send every field.</w:t>
       </w:r>
     </w:p>
     <w:p>
@@ -19489,7 +19489,7 @@
           <w:i w:val="0"/>
           <w:sz w:val="22"/>
         </w:rPr>
-        <w:t xml:space="preserve">Local deploy without a schema check (DEF-08). </w:t>
+        <w:t xml:space="preserve">Local models on other columns (DEF-08, closed). </w:t>
       </w:r>
       <w:r>
         <w:rPr>
@@ -19498,7 +19498,7 @@
           <w:i w:val="0"/>
           <w:sz w:val="22"/>
         </w:rPr>
-        <w:t>Training on the raw UNSW file now uses only the 15 flow features. Workaround for other files: train only on CSVs with the 15 flow features and a label, as the bundled datasets are.</w:t>
+        <w:t>Local mode still deploys a model trained on other columns (by decision); train.py now warns, and Live Monitor and cloud publishing refuse such a model.</w:t>
       </w:r>
     </w:p>
     <w:p>
@@ -19517,7 +19517,7 @@
           <w:i w:val="0"/>
           <w:sz w:val="22"/>
         </w:rPr>
-        <w:t xml:space="preserve">UTC labels (DEF-16). </w:t>
+        <w:t xml:space="preserve">Times are UTC (DEF-16, closed). </w:t>
       </w:r>
       <w:r>
         <w:rPr>
@@ -19526,7 +19526,7 @@
           <w:i w:val="0"/>
           <w:sz w:val="22"/>
         </w:rPr>
-        <w:t>Fixed in 128855e and covered by automated tests; the in-app check on that build is still to be done. Until then, read unlabelled times as UTC (Asia/Manila is UTC+8).</w:t>
+        <w:t>Every page now says UTC; Asia/Manila is UTC+8, so a time of 22:00 UTC is 06:00 the next day locally.</w:t>
       </w:r>
     </w:p>
     <w:p>
@@ -19805,7 +19805,7 @@
           <w:i w:val="0"/>
           <w:sz w:val="22"/>
         </w:rPr>
-        <w:t>Restart the app on the final build before the last regression runs; the final UI check ran on the earlier fix build because the app had not been restarted.</w:t>
+        <w:t>Check which build the running app is on before each regression run; one UI check ran on an earlier fix build because the app had not been restarted, and had to be repeated.</w:t>
       </w:r>
     </w:p>
     <w:p>
@@ -20010,7 +20010,26 @@
           <w:i w:val="0"/>
           <w:sz w:val="22"/>
         </w:rPr>
-        <w:t>2026-10-20 Fixes: at the Lead Architect's request the Low/Medium product and CI defects were fixed separately from the test runs (branch cycle1-fixes, nine commits eecaac7..128855e on main) and verified in REG-01 on the fix builds 0480899 and 128855e. Not changed, pending a decision: missing numeric fields are still filled with training defaults at the server (DEF-12) and local --deploy has no feature-schema check (DEF-08). Model defects DEF-04..07, and DEF-10, 11, 17 are left for cycle 2.</w:t>
+        <w:t>2026-10-20 Fixes: at the Lead Architect's request the Low/Medium product and CI defects were fixed separately from the test runs (branch cycle1-fixes, nine commits eecaac7..128855e on main) and verified in REG-01 on the fix builds 0480899 and 128855e. Model defects DEF-04..07, and DEF-10, 11, 17 are left for cycle 2.</w:t>
+      </w:r>
+    </w:p>
+    <w:p>
+      <w:pPr>
+        <w:pStyle w:val="ListParagraph"/>
+        <w:numPr>
+          <w:ilvl w:val="0"/>
+          <w:numId w:val="2"/>
+        </w:numPr>
+        <w:spacing w:after="40"/>
+      </w:pPr>
+      <w:r>
+        <w:rPr>
+          <w:rFonts w:ascii="Times New Roman" w:hAnsi="Times New Roman"/>
+          <w:b w:val="0"/>
+          <w:i w:val="0"/>
+          <w:sz w:val="22"/>
+        </w:rPr>
+        <w:t>2026-10-20 ~10:10 Lead Architect decision ('do everything and finish it'): DEF-12 - the server now refuses omitted, null or empty prediction fields instead of filling in training defaults (063f42f; a documented API change, README updated); DEF-08 - training always drops id and attack_cat, and train.py warns before training and before --deploy when a model does not use the 15 live flow features, instead of refusing local custom models (213d0be). Final build 213d0be. Signatures on the Completion Report and the UAT sheet are left for the signatories to add later.</w:t>
       </w:r>
     </w:p>
     <w:p>

</xml_diff>

<commit_message>
docs: add the UAT dry run to the cycle 1 status and completion reports (DOC-05, DOC-06)
</commit_message>
<xml_diff>
--- a/docs/testing/cycle-1/3 - AlgoGuard Test Completion Report v1.0.docx
+++ b/docs/testing/cycle-1/3 - AlgoGuard Test Completion Report v1.0.docx
@@ -1274,7 +1274,7 @@
           <w:i w:val="0"/>
           <w:sz w:val="22"/>
         </w:rPr>
-        <w:t>Testing ran on PC A from 2026-10-19 10:45 to 2026-10-20 10:23 (Asia/Manila), two days after the planned window. The Test Log holds 106 executions — 74 passed, 20 failed, 12 not executed — and 18 defects (4 High, 7 Medium, 7 Low, none Critical); 11 were fixed, re-tested and closed during the cycle.</w:t>
+        <w:t>Testing ran on PC A from 2026-10-19 10:45 to 2026-10-20 10:44 (Asia/Manila), two days after the planned window. The Test Log holds 111 executions — 77 passed, 20 failed, 13 not executed — and 18 defects (4 High, 7 Medium, 7 Low, none Critical); 11 were fixed, re-tested and closed during the cycle.</w:t>
       </w:r>
     </w:p>
     <w:p>
@@ -3446,7 +3446,7 @@
                 <w:sz w:val="20"/>
                 <w:szCs w:val="20"/>
               </w:rPr>
-              <w:t xml:space="preserve">0 / 0 / 1</w:t>
+              <w:t xml:space="preserve">3 / 0 / 3</w:t>
             </w:r>
           </w:p>
         </w:tc>
@@ -3476,7 +3476,7 @@
                 <w:sz w:val="20"/>
                 <w:szCs w:val="20"/>
               </w:rPr>
-              <w:t xml:space="preserve">Four scenarios written; awaiting the Product Owner (TC-15 not executed).</w:t>
+              <w:t xml:space="preserve">Four scenarios written; dry run of scenarios 1-3 on the final build passed, scenario 4 not run; TC-15 blocked on the Product Owner's decision and signature.</w:t>
             </w:r>
           </w:p>
         </w:tc>
@@ -3506,7 +3506,7 @@
                 <w:sz w:val="20"/>
                 <w:szCs w:val="20"/>
               </w:rPr>
-              <w:t xml:space="preserve">To Do</w:t>
+              <w:t xml:space="preserve">Review</w:t>
             </w:r>
           </w:p>
         </w:tc>
@@ -5542,7 +5542,7 @@
                 <w:sz w:val="20"/>
                 <w:szCs w:val="20"/>
               </w:rPr>
-              <w:t xml:space="preserve">Not executed</w:t>
+              <w:t xml:space="preserve">Blocked</w:t>
             </w:r>
           </w:p>
         </w:tc>
@@ -5572,7 +5572,7 @@
                 <w:sz w:val="20"/>
                 <w:szCs w:val="20"/>
               </w:rPr>
-              <w:t xml:space="preserve">Awaiting the Product Owner.</w:t>
+              <w:t xml:space="preserve">Dry run of UAT scenarios 1-3 passed on the final build; waiting for the Product Owner's accept/reject decision and signature.</w:t>
             </w:r>
           </w:p>
         </w:tc>
@@ -17126,7 +17126,7 @@
                 <w:sz w:val="20"/>
                 <w:szCs w:val="20"/>
               </w:rPr>
-              <w:t xml:space="preserve">TC-15</w:t>
+              <w:t xml:space="preserve">UAT-01.4</w:t>
             </w:r>
           </w:p>
         </w:tc>
@@ -17186,7 +17186,7 @@
                 <w:sz w:val="20"/>
                 <w:szCs w:val="20"/>
               </w:rPr>
-              <w:t xml:space="preserve">Awaiting the Product Owner.</w:t>
+              <w:t xml:space="preserve">UAT scenario 4 (administrator approves a member) needs the Administrator account and a test analyst prepared to await approval; not prepared. Covered by an automated test and the pilot.</w:t>
             </w:r>
           </w:p>
         </w:tc>
@@ -17583,7 +17583,7 @@
                 <w:sz w:val="20"/>
                 <w:szCs w:val="20"/>
               </w:rPr>
-              <w:t xml:space="preserve">84.6% of executed test cases (11 of 13: TC-01, TC-02, TC-04, TC-05, TC-08, TC-09, TC-10, TC-12, TC-13, TC-14, TC-16 passed on their latest run; TC-03 and TC-11 failed; TC-06, TC-07, TC-15 not executed). 78.7% of executed Test Log rows (74 Pass of 94, earlier failed runs included).</w:t>
+              <w:t xml:space="preserve">84.6% of executed test cases (11 of 13: TC-01, TC-02, TC-04, TC-05, TC-08, TC-09, TC-10, TC-12, TC-13, TC-14, TC-16 passed on their latest run; TC-03 and TC-11 failed; TC-06 and TC-07 not executed; TC-15 blocked on the Product Owner's decision). 79.4% of executed Test Log rows (77 Pass of 97, earlier failed runs included).</w:t>
             </w:r>
           </w:p>
         </w:tc>

</xml_diff>